<commit_message>
Paper: six figures (architecture, room maps, per-room presses, timeline, variants, cost of each change)
Drawn from the run logs by the same stats dump the text uses, so every
figure traces to a file; PNG sources kept next to the docx.

Co-Authored-By: Claude Opus 5 <noreply@anthropic.com>
</commit_message>
<xml_diff>
--- a/paper/AURA_v2_documentation.docx
+++ b/paper/AURA_v2_documentation.docx
@@ -1582,77 +1582,45 @@
     </w:p>
     <w:p>
       <w:pPr>
-        <w:spacing w:before="0" w:after="0" w:line="240" w:lineRule="auto"/>
-        <w:ind w:left="284"/>
-        <w:jc w:val="left"/>
+        <w:keepNext/>
+        <w:spacing w:before="120" w:after="60" w:line="240" w:lineRule="auto"/>
+        <w:jc w:val="center"/>
       </w:pPr>
       <w:r>
-        <w:rPr>
-          <w:rFonts w:ascii="Courier New" w:hAnsi="Courier New" w:eastAsia="Courier New" w:cs="Courier New"/>
-          <w:sz w:val="18"/>
-          <w:color w:val="000000"/>
-        </w:rPr>
-        <w:t xml:space="preserve">Environment (движок, истинные правила)</w:t>
-      </w:r>
-    </w:p>
-    <w:p>
-      <w:pPr>
-        <w:spacing w:before="0" w:after="0" w:line="240" w:lineRule="auto"/>
-        <w:ind w:left="284"/>
-        <w:jc w:val="left"/>
-      </w:pPr>
-      <w:r>
-        <w:rPr>
-          <w:rFonts w:ascii="Courier New" w:hAnsi="Courier New" w:eastAsia="Courier New" w:cs="Courier New"/>
-          <w:sz w:val="18"/>
-          <w:color w:val="000000"/>
-        </w:rPr>
-        <w:t xml:space="preserve">   ↓ наблюдение без причин (аудит 48 токенов)</w:t>
-      </w:r>
-    </w:p>
-    <w:p>
-      <w:pPr>
-        <w:spacing w:before="0" w:after="0" w:line="240" w:lineRule="auto"/>
-        <w:ind w:left="284"/>
-        <w:jc w:val="left"/>
-      </w:pPr>
-      <w:r>
-        <w:rPr>
-          <w:rFonts w:ascii="Courier New" w:hAnsi="Courier New" w:eastAsia="Courier New" w:cs="Courier New"/>
-          <w:sz w:val="18"/>
-          <w:color w:val="000000"/>
-        </w:rPr>
-        <w:t xml:space="preserve">Agent (языковая модель, запечатана)</w:t>
-      </w:r>
-    </w:p>
-    <w:p>
-      <w:pPr>
-        <w:spacing w:before="0" w:after="0" w:line="240" w:lineRule="auto"/>
-        <w:ind w:left="284"/>
-        <w:jc w:val="left"/>
-      </w:pPr>
-      <w:r>
-        <w:rPr>
-          <w:rFonts w:ascii="Courier New" w:hAnsi="Courier New" w:eastAsia="Courier New" w:cs="Courier New"/>
-          <w:sz w:val="18"/>
-          <w:color w:val="000000"/>
-        </w:rPr>
-        <w:t xml:space="preserve">   ↓ кнопка + четыре предсказания + флаг противоречия</w:t>
-      </w:r>
-    </w:p>
-    <w:p>
-      <w:pPr>
-        <w:spacing w:before="0" w:after="120" w:line="240" w:lineRule="auto"/>
-        <w:ind w:left="284"/>
-        <w:jc w:val="left"/>
-      </w:pPr>
-      <w:r>
-        <w:rPr>
-          <w:rFonts w:ascii="Courier New" w:hAnsi="Courier New" w:eastAsia="Courier New" w:cs="Courier New"/>
-          <w:sz w:val="18"/>
-          <w:color w:val="000000"/>
-        </w:rPr>
-        <w:t xml:space="preserve">Environment → результат → журнал JSONL → метрики</w:t>
+        <w:drawing>
+          <wp:inline distT="0" distB="0" distL="0" distR="0">
+            <wp:extent cx="5486400" cy="2261152"/>
+            <wp:docPr id="101" name="Picture 1"/>
+            <wp:cNvGraphicFramePr>
+              <a:graphicFrameLocks xmlns:a="http://schemas.openxmlformats.org/drawingml/2006/main" noChangeAspect="1"/>
+            </wp:cNvGraphicFramePr>
+            <a:graphic xmlns:a="http://schemas.openxmlformats.org/drawingml/2006/main">
+              <a:graphicData uri="http://schemas.openxmlformats.org/drawingml/2006/picture">
+                <pic:pic xmlns:pic="http://schemas.openxmlformats.org/drawingml/2006/picture">
+                  <pic:nvPicPr>
+                    <pic:cNvPr id="0" name="image1.png"/>
+                    <pic:cNvPicPr/>
+                  </pic:nvPicPr>
+                  <pic:blipFill>
+                    <a:blip r:embed="rIdImg1"/>
+                    <a:stretch>
+                      <a:fillRect/>
+                    </a:stretch>
+                  </pic:blipFill>
+                  <pic:spPr>
+                    <a:xfrm>
+                      <a:off x="0" y="0"/>
+                      <a:ext cx="5486400" cy="2261152"/>
+                    </a:xfrm>
+                    <a:prstGeom prst="rect">
+                      <a:avLst/>
+                    </a:prstGeom>
+                  </pic:spPr>
+                </pic:pic>
+              </a:graphicData>
+            </a:graphic>
+          </wp:inline>
+        </w:drawing>
       </w:r>
     </w:p>
     <w:p>
@@ -1668,7 +1636,7 @@
           <w:color w:val="000000"/>
           <w:sz w:val="20"/>
         </w:rPr>
-        <w:t xml:space="preserve">Рис. 1. Цикл одного хода. Стрелка «вниз» от среды несёт только наблюдаемое; причины остаются в движке.</w:t>
+        <w:t xml:space="preserve">Рис. 1. Цикл одного хода. От среды к агенту идёт только наблюдаемое; причины остаются в движке.</w:t>
       </w:r>
     </w:p>
     <w:p>
@@ -3706,6 +3674,65 @@
     </w:p>
     <w:p>
       <w:pPr>
+        <w:keepNext/>
+        <w:spacing w:before="120" w:after="60" w:line="240" w:lineRule="auto"/>
+        <w:jc w:val="center"/>
+      </w:pPr>
+      <w:r>
+        <w:drawing>
+          <wp:inline distT="0" distB="0" distL="0" distR="0">
+            <wp:extent cx="5486400" cy="4789800"/>
+            <wp:docPr id="102" name="Picture 2"/>
+            <wp:cNvGraphicFramePr>
+              <a:graphicFrameLocks xmlns:a="http://schemas.openxmlformats.org/drawingml/2006/main" noChangeAspect="1"/>
+            </wp:cNvGraphicFramePr>
+            <a:graphic xmlns:a="http://schemas.openxmlformats.org/drawingml/2006/main">
+              <a:graphicData uri="http://schemas.openxmlformats.org/drawingml/2006/picture">
+                <pic:pic xmlns:pic="http://schemas.openxmlformats.org/drawingml/2006/picture">
+                  <pic:nvPicPr>
+                    <pic:cNvPr id="0" name="image2.png"/>
+                    <pic:cNvPicPr/>
+                  </pic:nvPicPr>
+                  <pic:blipFill>
+                    <a:blip r:embed="rIdImg2"/>
+                    <a:stretch>
+                      <a:fillRect/>
+                    </a:stretch>
+                  </pic:blipFill>
+                  <pic:spPr>
+                    <a:xfrm>
+                      <a:off x="0" y="0"/>
+                      <a:ext cx="5486400" cy="4789800"/>
+                    </a:xfrm>
+                    <a:prstGeom prst="rect">
+                      <a:avLst/>
+                    </a:prstGeom>
+                  </pic:spPr>
+                </pic:pic>
+              </a:graphicData>
+            </a:graphic>
+          </wp:inline>
+        </w:drawing>
+      </w:r>
+    </w:p>
+    <w:p>
+      <w:pPr>
+        <w:spacing w:before="0" w:after="160" w:line="360" w:lineRule="auto"/>
+        <w:jc w:val="center"/>
+      </w:pPr>
+      <w:r>
+        <w:rPr>
+          <w:rFonts w:ascii="Times New Roman" w:hAnsi="Times New Roman" w:eastAsia="Times New Roman" w:cs="Times New Roman"/>
+          <w:b w:val="0"/>
+          <w:i/>
+          <w:color w:val="000000"/>
+          <w:sz w:val="20"/>
+        </w:rPr>
+        <w:t xml:space="preserve">Рис. 2. Карты одиннадцати комнат. Кольца и спицы нарисованы как пара; какая из них завершает комнату, агенту не сообщается.</w:t>
+      </w:r>
+    </w:p>
+    <w:p>
+      <w:pPr>
         <w:spacing w:before="0" w:after="120" w:line="360" w:lineRule="auto"/>
         <w:jc w:val="both"/>
       </w:pPr>
@@ -3750,7 +3777,7 @@
           <w:color w:val="000000"/>
           <w:sz w:val="24"/>
         </w:rPr>
-        <w:t xml:space="preserve">Каждый ход агент получает одно наблюдение в формате JSON (рис. 2): номер комнаты, сетку с обезличенными именами клеток (</w:t>
+        <w:t xml:space="preserve">Каждый ход агент получает одно наблюдение в формате JSON (рис. 3): номер комнаты, сетку с обезличенными именами клеток (</w:t>
       </w:r>
       <w:r>
         <w:rPr>
@@ -4091,7 +4118,7 @@
           <w:color w:val="000000"/>
           <w:sz w:val="20"/>
         </w:rPr>
-        <w:t xml:space="preserve">Рис. 2. Наблюдение на шаге 11 основного прогона (комната 3, после первого возврата на старт), сокращено.</w:t>
+        <w:t xml:space="preserve">Рис. 3. Наблюдение на шаге 11 основного прогона (комната 3, после первого возврата на старт), сокращено.</w:t>
       </w:r>
     </w:p>
     <w:p>
@@ -4172,7 +4199,7 @@
           <w:color w:val="000000"/>
           <w:sz w:val="24"/>
         </w:rPr>
-        <w:t xml:space="preserve">Ответ (рис. 3) содержит кнопку, гипотезу (что этим нажатием проверяется), предсказание словами, четыре проверяемых поля и флаг противоречия: что из увиденного расходится с тем, во что агент верил. Четыре поля — конечная клетка, изменилась ли позиция, оказалась ли сущность на стартовой клетке комнаты, сменится ли комната. Любое поле можно оставить пустым, и это засчитывается как отказ от ответа, а не как ошибка; инструкция прямо говорит, что гадать хуже, чем промолчать.</w:t>
+        <w:t xml:space="preserve">Ответ (рис. 4) содержит кнопку, гипотезу (что этим нажатием проверяется), предсказание словами, четыре проверяемых поля и флаг противоречия: что из увиденного расходится с тем, во что агент верил. Четыре поля — конечная клетка, изменилась ли позиция, оказалась ли сущность на стартовой клетке комнаты, сменится ли комната. Любое поле можно оставить пустым, и это засчитывается как отказ от ответа, а не как ошибка; инструкция прямо говорит, что гадать хуже, чем промолчать.</w:t>
       </w:r>
     </w:p>
     <w:p>
@@ -4293,7 +4320,7 @@
           <w:color w:val="000000"/>
           <w:sz w:val="20"/>
         </w:rPr>
-        <w:t xml:space="preserve">Рис. 3. Ответ агента на шаге 11 основного прогона: первое нажатие после возврата на старт в комнате 3.</w:t>
+        <w:t xml:space="preserve">Рис. 4. Ответ агента на шаге 11 основного прогона: первое нажатие после возврата на старт в комнате 3.</w:t>
       </w:r>
     </w:p>
     <w:p>
@@ -6983,6 +7010,65 @@
     </w:p>
     <w:p>
       <w:pPr>
+        <w:keepNext/>
+        <w:spacing w:before="120" w:after="60" w:line="240" w:lineRule="auto"/>
+        <w:jc w:val="center"/>
+      </w:pPr>
+      <w:r>
+        <w:drawing>
+          <wp:inline distT="0" distB="0" distL="0" distR="0">
+            <wp:extent cx="5486400" cy="2598558"/>
+            <wp:docPr id="103" name="Picture 3"/>
+            <wp:cNvGraphicFramePr>
+              <a:graphicFrameLocks xmlns:a="http://schemas.openxmlformats.org/drawingml/2006/main" noChangeAspect="1"/>
+            </wp:cNvGraphicFramePr>
+            <a:graphic xmlns:a="http://schemas.openxmlformats.org/drawingml/2006/main">
+              <a:graphicData uri="http://schemas.openxmlformats.org/drawingml/2006/picture">
+                <pic:pic xmlns:pic="http://schemas.openxmlformats.org/drawingml/2006/picture">
+                  <pic:nvPicPr>
+                    <pic:cNvPr id="0" name="image3.png"/>
+                    <pic:cNvPicPr/>
+                  </pic:nvPicPr>
+                  <pic:blipFill>
+                    <a:blip r:embed="rIdImg3"/>
+                    <a:stretch>
+                      <a:fillRect/>
+                    </a:stretch>
+                  </pic:blipFill>
+                  <pic:spPr>
+                    <a:xfrm>
+                      <a:off x="0" y="0"/>
+                      <a:ext cx="5486400" cy="2598558"/>
+                    </a:xfrm>
+                    <a:prstGeom prst="rect">
+                      <a:avLst/>
+                    </a:prstGeom>
+                  </pic:spPr>
+                </pic:pic>
+              </a:graphicData>
+            </a:graphic>
+          </wp:inline>
+        </w:drawing>
+      </w:r>
+    </w:p>
+    <w:p>
+      <w:pPr>
+        <w:spacing w:before="0" w:after="160" w:line="360" w:lineRule="auto"/>
+        <w:jc w:val="center"/>
+      </w:pPr>
+      <w:r>
+        <w:rPr>
+          <w:rFonts w:ascii="Times New Roman" w:hAnsi="Times New Roman" w:eastAsia="Times New Roman" w:cs="Times New Roman"/>
+          <w:b w:val="0"/>
+          <w:i/>
+          <w:color w:val="000000"/>
+          <w:sz w:val="20"/>
+        </w:rPr>
+        <w:t xml:space="preserve">Рис. 5. Нажатий на комнату против кратчайшего пути в основном прогоне; крестики — возвраты на старт.</w:t>
+      </w:r>
+    </w:p>
+    <w:p>
+      <w:pPr>
         <w:spacing w:before="0" w:after="120" w:line="360" w:lineRule="auto"/>
         <w:jc w:val="both"/>
       </w:pPr>
@@ -7657,6 +7743,65 @@
           <w:sz w:val="20"/>
         </w:rPr>
         <w:t xml:space="preserve">Табл. 3. Обнаружение и восстановление по каждой смене. Шаги — глобальные номера нажатий; задержка — от первого свидетельства до R1.</w:t>
+      </w:r>
+    </w:p>
+    <w:p>
+      <w:pPr>
+        <w:keepNext/>
+        <w:spacing w:before="120" w:after="60" w:line="240" w:lineRule="auto"/>
+        <w:jc w:val="center"/>
+      </w:pPr>
+      <w:r>
+        <w:drawing>
+          <wp:inline distT="0" distB="0" distL="0" distR="0">
+            <wp:extent cx="5486400" cy="2123767"/>
+            <wp:docPr id="104" name="Picture 4"/>
+            <wp:cNvGraphicFramePr>
+              <a:graphicFrameLocks xmlns:a="http://schemas.openxmlformats.org/drawingml/2006/main" noChangeAspect="1"/>
+            </wp:cNvGraphicFramePr>
+            <a:graphic xmlns:a="http://schemas.openxmlformats.org/drawingml/2006/main">
+              <a:graphicData uri="http://schemas.openxmlformats.org/drawingml/2006/picture">
+                <pic:pic xmlns:pic="http://schemas.openxmlformats.org/drawingml/2006/picture">
+                  <pic:nvPicPr>
+                    <pic:cNvPr id="0" name="image4.png"/>
+                    <pic:cNvPicPr/>
+                  </pic:nvPicPr>
+                  <pic:blipFill>
+                    <a:blip r:embed="rIdImg4"/>
+                    <a:stretch>
+                      <a:fillRect/>
+                    </a:stretch>
+                  </pic:blipFill>
+                  <pic:spPr>
+                    <a:xfrm>
+                      <a:off x="0" y="0"/>
+                      <a:ext cx="5486400" cy="2123767"/>
+                    </a:xfrm>
+                    <a:prstGeom prst="rect">
+                      <a:avLst/>
+                    </a:prstGeom>
+                  </pic:spPr>
+                </pic:pic>
+              </a:graphicData>
+            </a:graphic>
+          </wp:inline>
+        </w:drawing>
+      </w:r>
+    </w:p>
+    <w:p>
+      <w:pPr>
+        <w:spacing w:before="0" w:after="160" w:line="360" w:lineRule="auto"/>
+        <w:jc w:val="center"/>
+      </w:pPr>
+      <w:r>
+        <w:rPr>
+          <w:rFonts w:ascii="Times New Roman" w:hAnsi="Times New Roman" w:eastAsia="Times New Roman" w:cs="Times New Roman"/>
+          <w:b w:val="0"/>
+          <w:i/>
+          <w:color w:val="000000"/>
+          <w:sz w:val="20"/>
+        </w:rPr>
+        <w:t xml:space="preserve">Рис. 6. Основной прогон по нажатиям: комнаты, обе смены правил, возвраты на старт и моменты свидетельства, R2 и строгого R1.</w:t>
       </w:r>
     </w:p>
     <w:p>
@@ -10868,6 +11013,124 @@
     </w:p>
     <w:p>
       <w:pPr>
+        <w:keepNext/>
+        <w:spacing w:before="120" w:after="60" w:line="240" w:lineRule="auto"/>
+        <w:jc w:val="center"/>
+      </w:pPr>
+      <w:r>
+        <w:drawing>
+          <wp:inline distT="0" distB="0" distL="0" distR="0">
+            <wp:extent cx="5486400" cy="2753175"/>
+            <wp:docPr id="105" name="Picture 5"/>
+            <wp:cNvGraphicFramePr>
+              <a:graphicFrameLocks xmlns:a="http://schemas.openxmlformats.org/drawingml/2006/main" noChangeAspect="1"/>
+            </wp:cNvGraphicFramePr>
+            <a:graphic xmlns:a="http://schemas.openxmlformats.org/drawingml/2006/main">
+              <a:graphicData uri="http://schemas.openxmlformats.org/drawingml/2006/picture">
+                <pic:pic xmlns:pic="http://schemas.openxmlformats.org/drawingml/2006/picture">
+                  <pic:nvPicPr>
+                    <pic:cNvPr id="0" name="image5.png"/>
+                    <pic:cNvPicPr/>
+                  </pic:nvPicPr>
+                  <pic:blipFill>
+                    <a:blip r:embed="rIdImg5"/>
+                    <a:stretch>
+                      <a:fillRect/>
+                    </a:stretch>
+                  </pic:blipFill>
+                  <pic:spPr>
+                    <a:xfrm>
+                      <a:off x="0" y="0"/>
+                      <a:ext cx="5486400" cy="2753175"/>
+                    </a:xfrm>
+                    <a:prstGeom prst="rect">
+                      <a:avLst/>
+                    </a:prstGeom>
+                  </pic:spPr>
+                </pic:pic>
+              </a:graphicData>
+            </a:graphic>
+          </wp:inline>
+        </w:drawing>
+      </w:r>
+    </w:p>
+    <w:p>
+      <w:pPr>
+        <w:spacing w:before="0" w:after="160" w:line="360" w:lineRule="auto"/>
+        <w:jc w:val="center"/>
+      </w:pPr>
+      <w:r>
+        <w:rPr>
+          <w:rFonts w:ascii="Times New Roman" w:hAnsi="Times New Roman" w:eastAsia="Times New Roman" w:cs="Times New Roman"/>
+          <w:b w:val="0"/>
+          <w:i/>
+          <w:color w:val="000000"/>
+          <w:sz w:val="20"/>
+        </w:rPr>
+        <w:t xml:space="preserve">Рис. 7. Нажатий на комнату в пяти прогонах; крестик — в комнате был возврат на старт. Пик вариации B в комнате 8 — четыре гибели на одной клетке.</w:t>
+      </w:r>
+    </w:p>
+    <w:p>
+      <w:pPr>
+        <w:keepNext/>
+        <w:spacing w:before="120" w:after="60" w:line="240" w:lineRule="auto"/>
+        <w:jc w:val="center"/>
+      </w:pPr>
+      <w:r>
+        <w:drawing>
+          <wp:inline distT="0" distB="0" distL="0" distR="0">
+            <wp:extent cx="5486400" cy="2029320"/>
+            <wp:docPr id="106" name="Picture 6"/>
+            <wp:cNvGraphicFramePr>
+              <a:graphicFrameLocks xmlns:a="http://schemas.openxmlformats.org/drawingml/2006/main" noChangeAspect="1"/>
+            </wp:cNvGraphicFramePr>
+            <a:graphic xmlns:a="http://schemas.openxmlformats.org/drawingml/2006/main">
+              <a:graphicData uri="http://schemas.openxmlformats.org/drawingml/2006/picture">
+                <pic:pic xmlns:pic="http://schemas.openxmlformats.org/drawingml/2006/picture">
+                  <pic:nvPicPr>
+                    <pic:cNvPr id="0" name="image6.png"/>
+                    <pic:cNvPicPr/>
+                  </pic:nvPicPr>
+                  <pic:blipFill>
+                    <a:blip r:embed="rIdImg6"/>
+                    <a:stretch>
+                      <a:fillRect/>
+                    </a:stretch>
+                  </pic:blipFill>
+                  <pic:spPr>
+                    <a:xfrm>
+                      <a:off x="0" y="0"/>
+                      <a:ext cx="5486400" cy="2029320"/>
+                    </a:xfrm>
+                    <a:prstGeom prst="rect">
+                      <a:avLst/>
+                    </a:prstGeom>
+                  </pic:spPr>
+                </pic:pic>
+              </a:graphicData>
+            </a:graphic>
+          </wp:inline>
+        </w:drawing>
+      </w:r>
+    </w:p>
+    <w:p>
+      <w:pPr>
+        <w:spacing w:before="0" w:after="160" w:line="360" w:lineRule="auto"/>
+        <w:jc w:val="center"/>
+      </w:pPr>
+      <w:r>
+        <w:rPr>
+          <w:rFonts w:ascii="Times New Roman" w:hAnsi="Times New Roman" w:eastAsia="Times New Roman" w:cs="Times New Roman"/>
+          <w:b w:val="0"/>
+          <w:i/>
+          <w:color w:val="000000"/>
+          <w:sz w:val="20"/>
+        </w:rPr>
+        <w:t xml:space="preserve">Рис. 8. Цена каждой смены: гибели по старому правилу и задержка от первого свидетельства до строгого R1.</w:t>
+      </w:r>
+    </w:p>
+    <w:p>
+      <w:pPr>
         <w:spacing w:before="0" w:after="120" w:line="360" w:lineRule="auto"/>
         <w:jc w:val="both"/>
       </w:pPr>

</xml_diff>

<commit_message>
Paper: review pass -- coverage metric, exact collateral numbers, causal claims softened, memory/leakage/schema wording, TOC field, review draft, fuller diary, refs 1 and 5 fixed
Co-Authored-By: Claude Opus 5 <noreply@anthropic.com>
</commit_message>
<xml_diff>
--- a/paper/AURA_v2_documentation.docx
+++ b/paper/AURA_v2_documentation.docx
@@ -136,280 +136,28 @@
     </w:p>
     <w:p>
       <w:pPr>
-        <w:tabs>
-          <w:tab w:pos="8617" w:val="right"/>
-        </w:tabs>
         <w:spacing w:before="0" w:after="0" w:line="360" w:lineRule="auto"/>
-        <w:jc w:val="left"/>
-      </w:pPr>
+      </w:pPr>
+      <w:r>
+        <w:fldChar w:fldCharType="begin" w:dirty="true"/>
+      </w:r>
+      <w:r>
+        <w:instrText xml:space="preserve"> TOC \o "1-3" \h \z \u </w:instrText>
+      </w:r>
+      <w:r>
+        <w:fldChar w:fldCharType="separate"/>
+      </w:r>
       <w:r>
         <w:rPr>
           <w:rFonts w:ascii="Times New Roman" w:hAnsi="Times New Roman" w:eastAsia="Times New Roman" w:cs="Times New Roman"/>
-          <w:b w:val="0"/>
-          <w:i w:val="0"/>
-          <w:color w:val="000000"/>
+          <w:i/>
+          <w:color w:val="6E6E6E"/>
           <w:sz w:val="24"/>
         </w:rPr>
-        <w:t>АҢДАТПА</w:t>
-        <w:tab/>
-        <w:t>[стр.]</w:t>
+        <w:t>Оглавление обновляется автоматически: при открытии нажмите «Да», либо выделите его и нажмите F9.</w:t>
       </w:r>
-    </w:p>
-    <w:p>
-      <w:pPr>
-        <w:tabs>
-          <w:tab w:pos="8617" w:val="right"/>
-        </w:tabs>
-        <w:spacing w:before="0" w:after="0" w:line="360" w:lineRule="auto"/>
-        <w:jc w:val="left"/>
-      </w:pPr>
       <w:r>
-        <w:rPr>
-          <w:rFonts w:ascii="Times New Roman" w:hAnsi="Times New Roman" w:eastAsia="Times New Roman" w:cs="Times New Roman"/>
-          <w:b w:val="0"/>
-          <w:i w:val="0"/>
-          <w:color w:val="000000"/>
-          <w:sz w:val="24"/>
-        </w:rPr>
-        <w:t>АБСТРАКТ (АННОТАЦИЯ)</w:t>
-        <w:tab/>
-        <w:t>[стр.]</w:t>
-      </w:r>
-    </w:p>
-    <w:p>
-      <w:pPr>
-        <w:tabs>
-          <w:tab w:pos="8617" w:val="right"/>
-        </w:tabs>
-        <w:spacing w:before="0" w:after="0" w:line="360" w:lineRule="auto"/>
-        <w:jc w:val="left"/>
-      </w:pPr>
-      <w:r>
-        <w:rPr>
-          <w:rFonts w:ascii="Times New Roman" w:hAnsi="Times New Roman" w:eastAsia="Times New Roman" w:cs="Times New Roman"/>
-          <w:b w:val="0"/>
-          <w:i w:val="0"/>
-          <w:color w:val="000000"/>
-          <w:sz w:val="24"/>
-        </w:rPr>
-        <w:t>ABSTRACT</w:t>
-        <w:tab/>
-        <w:t>[стр.]</w:t>
-      </w:r>
-    </w:p>
-    <w:p>
-      <w:pPr>
-        <w:tabs>
-          <w:tab w:pos="8617" w:val="right"/>
-        </w:tabs>
-        <w:spacing w:before="0" w:after="0" w:line="360" w:lineRule="auto"/>
-        <w:jc w:val="left"/>
-      </w:pPr>
-      <w:r>
-        <w:rPr>
-          <w:rFonts w:ascii="Times New Roman" w:hAnsi="Times New Roman" w:eastAsia="Times New Roman" w:cs="Times New Roman"/>
-          <w:b w:val="0"/>
-          <w:i w:val="0"/>
-          <w:color w:val="000000"/>
-          <w:sz w:val="24"/>
-        </w:rPr>
-        <w:t>ОТЗЫВ НАУЧНОГО РУКОВОДИТЕЛЯ</w:t>
-        <w:tab/>
-        <w:t>[стр.]</w:t>
-      </w:r>
-    </w:p>
-    <w:p>
-      <w:pPr>
-        <w:tabs>
-          <w:tab w:pos="8617" w:val="right"/>
-        </w:tabs>
-        <w:spacing w:before="0" w:after="0" w:line="360" w:lineRule="auto"/>
-        <w:jc w:val="left"/>
-      </w:pPr>
-      <w:r>
-        <w:rPr>
-          <w:rFonts w:ascii="Times New Roman" w:hAnsi="Times New Roman" w:eastAsia="Times New Roman" w:cs="Times New Roman"/>
-          <w:b w:val="0"/>
-          <w:i w:val="0"/>
-          <w:color w:val="000000"/>
-          <w:sz w:val="24"/>
-        </w:rPr>
-        <w:t>ВВЕДЕНИЕ</w:t>
-        <w:tab/>
-        <w:t>[стр.]</w:t>
-      </w:r>
-    </w:p>
-    <w:p>
-      <w:pPr>
-        <w:tabs>
-          <w:tab w:pos="8617" w:val="right"/>
-        </w:tabs>
-        <w:spacing w:before="0" w:after="0" w:line="360" w:lineRule="auto"/>
-        <w:jc w:val="left"/>
-      </w:pPr>
-      <w:r>
-        <w:rPr>
-          <w:rFonts w:ascii="Times New Roman" w:hAnsi="Times New Roman" w:eastAsia="Times New Roman" w:cs="Times New Roman"/>
-          <w:b w:val="0"/>
-          <w:i w:val="0"/>
-          <w:color w:val="000000"/>
-          <w:sz w:val="24"/>
-        </w:rPr>
-        <w:t>ИССЛЕДОВАТЕЛЬСКАЯ ЧАСТЬ</w:t>
-        <w:tab/>
-        <w:t>[стр.]</w:t>
-      </w:r>
-    </w:p>
-    <w:p>
-      <w:pPr>
-        <w:tabs>
-          <w:tab w:pos="8617" w:val="right"/>
-        </w:tabs>
-        <w:spacing w:before="0" w:after="0" w:line="360" w:lineRule="auto"/>
-        <w:jc w:val="left"/>
-      </w:pPr>
-      <w:r>
-        <w:rPr>
-          <w:rFonts w:ascii="Times New Roman" w:hAnsi="Times New Roman" w:eastAsia="Times New Roman" w:cs="Times New Roman"/>
-          <w:b w:val="0"/>
-          <w:i w:val="0"/>
-          <w:color w:val="000000"/>
-          <w:sz w:val="24"/>
-        </w:rPr>
-        <w:t>1. Аналитический обзор и постановка задачи</w:t>
-        <w:tab/>
-        <w:t>[стр.]</w:t>
-      </w:r>
-    </w:p>
-    <w:p>
-      <w:pPr>
-        <w:tabs>
-          <w:tab w:pos="8617" w:val="right"/>
-        </w:tabs>
-        <w:spacing w:before="0" w:after="0" w:line="360" w:lineRule="auto"/>
-        <w:jc w:val="left"/>
-      </w:pPr>
-      <w:r>
-        <w:rPr>
-          <w:rFonts w:ascii="Times New Roman" w:hAnsi="Times New Roman" w:eastAsia="Times New Roman" w:cs="Times New Roman"/>
-          <w:b w:val="0"/>
-          <w:i w:val="0"/>
-          <w:color w:val="000000"/>
-          <w:sz w:val="24"/>
-        </w:rPr>
-        <w:t>2. Методика исследования</w:t>
-        <w:tab/>
-        <w:t>[стр.]</w:t>
-      </w:r>
-    </w:p>
-    <w:p>
-      <w:pPr>
-        <w:tabs>
-          <w:tab w:pos="8617" w:val="right"/>
-        </w:tabs>
-        <w:spacing w:before="0" w:after="0" w:line="360" w:lineRule="auto"/>
-        <w:jc w:val="left"/>
-      </w:pPr>
-      <w:r>
-        <w:rPr>
-          <w:rFonts w:ascii="Times New Roman" w:hAnsi="Times New Roman" w:eastAsia="Times New Roman" w:cs="Times New Roman"/>
-          <w:b w:val="0"/>
-          <w:i w:val="0"/>
-          <w:color w:val="000000"/>
-          <w:sz w:val="24"/>
-        </w:rPr>
-        <w:t>3. Результаты экспериментов</w:t>
-        <w:tab/>
-        <w:t>[стр.]</w:t>
-      </w:r>
-    </w:p>
-    <w:p>
-      <w:pPr>
-        <w:tabs>
-          <w:tab w:pos="8617" w:val="right"/>
-        </w:tabs>
-        <w:spacing w:before="0" w:after="0" w:line="360" w:lineRule="auto"/>
-        <w:jc w:val="left"/>
-      </w:pPr>
-      <w:r>
-        <w:rPr>
-          <w:rFonts w:ascii="Times New Roman" w:hAnsi="Times New Roman" w:eastAsia="Times New Roman" w:cs="Times New Roman"/>
-          <w:b w:val="0"/>
-          <w:i w:val="0"/>
-          <w:color w:val="000000"/>
-          <w:sz w:val="24"/>
-        </w:rPr>
-        <w:t>4. Обсуждение результатов</w:t>
-        <w:tab/>
-        <w:t>[стр.]</w:t>
-      </w:r>
-    </w:p>
-    <w:p>
-      <w:pPr>
-        <w:tabs>
-          <w:tab w:pos="8617" w:val="right"/>
-        </w:tabs>
-        <w:spacing w:before="0" w:after="0" w:line="360" w:lineRule="auto"/>
-        <w:jc w:val="left"/>
-      </w:pPr>
-      <w:r>
-        <w:rPr>
-          <w:rFonts w:ascii="Times New Roman" w:hAnsi="Times New Roman" w:eastAsia="Times New Roman" w:cs="Times New Roman"/>
-          <w:b w:val="0"/>
-          <w:i w:val="0"/>
-          <w:color w:val="000000"/>
-          <w:sz w:val="24"/>
-        </w:rPr>
-        <w:t>ЗАКЛЮЧЕНИЕ</w:t>
-        <w:tab/>
-        <w:t>[стр.]</w:t>
-      </w:r>
-    </w:p>
-    <w:p>
-      <w:pPr>
-        <w:tabs>
-          <w:tab w:pos="8617" w:val="right"/>
-        </w:tabs>
-        <w:spacing w:before="0" w:after="0" w:line="360" w:lineRule="auto"/>
-        <w:jc w:val="left"/>
-      </w:pPr>
-      <w:r>
-        <w:rPr>
-          <w:rFonts w:ascii="Times New Roman" w:hAnsi="Times New Roman" w:eastAsia="Times New Roman" w:cs="Times New Roman"/>
-          <w:b w:val="0"/>
-          <w:i w:val="0"/>
-          <w:color w:val="000000"/>
-          <w:sz w:val="24"/>
-        </w:rPr>
-        <w:t>СПИСОК ИСПОЛЬЗОВАННОЙ ЛИТЕРАТУРЫ</w:t>
-        <w:tab/>
-        <w:t>[стр.]</w:t>
-      </w:r>
-    </w:p>
-    <w:p>
-      <w:pPr>
-        <w:tabs>
-          <w:tab w:pos="8617" w:val="right"/>
-        </w:tabs>
-        <w:spacing w:before="0" w:after="0" w:line="360" w:lineRule="auto"/>
-        <w:jc w:val="left"/>
-      </w:pPr>
-      <w:r>
-        <w:rPr>
-          <w:rFonts w:ascii="Times New Roman" w:hAnsi="Times New Roman" w:eastAsia="Times New Roman" w:cs="Times New Roman"/>
-          <w:b w:val="0"/>
-          <w:i w:val="0"/>
-          <w:color w:val="000000"/>
-          <w:sz w:val="24"/>
-        </w:rPr>
-        <w:t>ПРИЛОЖЕНИЯ</w:t>
-        <w:tab/>
-        <w:t>[стр.]</w:t>
-      </w:r>
-    </w:p>
-    <w:p>
-      <w:r>
-        <w:br w:type="page"/>
+        <w:fldChar w:fldCharType="end"/>
       </w:r>
     </w:p>
     <w:p>
@@ -475,7 +223,7 @@
           <w:color w:val="000000"/>
           <w:sz w:val="24"/>
         </w:rPr>
-        <w:t xml:space="preserve">Работа отвечает на вопрос, способен ли агент на большой языковой модели открыть правила неизвестного мира по наблюдениям, заметить, что одно из выученных правил перестало действовать, и пересмотреть именно его, не разрушив остального. Для этого построен стенд AURA: одиннадцать комнат-сеток, четыре кнопки без подписей, две похожие друг на друга поверхности (одна завершает комнату, другая возвращает на старт) и отражатель. Перед комнатой 7 значения двух поверхностей молча меняются местами, перед комнатой 10 возвращаются. Агент (codex, модель gpt-5.6-luna, запечатанный от файлов и сети) каждый ход видит только то, что видел бы человек на экране, нажимает одну кнопку и до нажатия записывает четыре проверяемых предсказания; критерий восстановления и ожидания зафиксированы до запуска. Результат: 11 из 11 комнат пройдены за 116 нажатий при 4 возвратах на старт; точность проверяемых полей 95%; обе смены правил восстановлены по строгому критерию (на шагах 90 и 116), причём второй пересмотр стоил один возврат вместо двух и 11 шагов вместо 25; точность по полям, которых смена не касалась, изменилась на 1 п.п. Значимость работы — в инструменте, который измеряет обнаружение, локальный пересмотр и сохранение знаний раздельно, проверяет отсутствие утечек и воспроизводит любой прогон по журналу. Вариации показали: смена, пришедшаяся на правило с одной комнатой опыта, стоит одну гибель вместо двух; три смены подряд приводят не к идее о смене, а к ложной модели «переключателей» (10 гибелей); отсутствие поля </w:t>
+        <w:t xml:space="preserve">Работа отвечает на вопрос, способен ли агент на большой языковой модели открыть правила неизвестного мира по наблюдениям, заметить, что одно из выученных правил перестало действовать, и пересмотреть именно его, не разрушив остального. Для этого построен стенд AURA: одиннадцать комнат-сеток, четыре кнопки без подписей, две похожие друг на друга поверхности (одна завершает комнату, другая возвращает на старт) и отражатель. Перед комнатой 7 значения двух поверхностей молча меняются местами, перед комнатой 10 возвращаются. Агент (codex, модель gpt-5.6-luna, запечатанный от файлов и сети) каждый ход видит только то, что видел бы человек на экране, нажимает одну кнопку и до нажатия записывает четыре проверяемых предсказания; критерий восстановления и ожидания зафиксированы до запуска. Результат: 11 из 11 комнат пройдены за 116 нажатий при 4 возвратах на старт; точность проверяемых полей 95% при полноте ответов 97%; обе смены правил восстановлены по строгому критерию (на шагах 90 и 116); второй пересмотр в этом прогоне стоил один возврат вместо двух и 11 шагов вместо 25; точность по полям, которых смена не касалась, не снизилась (+1,3 п.п.). Значимость работы — в инструменте, который различает поведенческий успех, обнаружение смены, пересмотр затронутого правила и сохранение незатронутого, проверяет наблюдения на лексические утечки и воспроизводит любой прогон по журналу. Все выводы относятся к одному субъекту при одном прогоне на условие. В четырёх вариациях (по одному прогону): смена, пришедшаяся на правило с одной комнатой опыта, стоила одну гибель вместо двух; три смены подряд сопровождались не идеей о смене, а ложной моделью «переключателей» (10 гибелей); без поля </w:t>
       </w:r>
       <w:r>
         <w:rPr>
@@ -495,7 +243,7 @@
           <w:color w:val="000000"/>
           <w:sz w:val="24"/>
         </w:rPr>
-        <w:t xml:space="preserve"> не мешает приобретению правила, но удлиняет первый пересмотр; при бюджете 25 агент действует по новому правилу, не предсказывая его.</w:t>
+        <w:t xml:space="preserve"> правило приобретается так же, но первый пересмотр дольше; при бюджете 25 агент действовал по новому правилу, оставляя предсказания о нём пустыми (полнота на изменённых полях 33% против 75%).</w:t>
       </w:r>
     </w:p>
     <w:p>
@@ -528,7 +276,7 @@
           <w:color w:val="000000"/>
           <w:sz w:val="24"/>
         </w:rPr>
-        <w:t xml:space="preserve">This work asks whether an LLM-based agent can discover the rules of an unknown world from observation alone, notice when a rule it relied on has silently changed, and revise that rule without wrecking the rest of what it knows. The instrument, AURA, is a curriculum of eleven grid rooms with four unlabeled buttons, two look-alike surfaces (one ends the room, the other returns the agent to the start) and a deflector. Before room 7 the two surfaces silently trade meanings; before room 10 they trade back. The subject (codex, gpt-5.6-luna, sealed) sees only what a person watching the screen would see, presses one button per turn and commits to four checkable predictions before each press; the recovery criterion was fixed before the runs. Result: 11/11 rooms in 116 presses with 4 returns to the start; 95% field accuracy; both rule changes recovered under the strict criterion (steps 90 and 116), the second revision costing one return instead of two; accuracy on untouched fields moved by 1 pp. The contribution is the instrument: it scores detection, local revision and retention separately, audits every observation for leaked causes, and replays any run from its log. Four variants show that a rule held for one room is dropped at one death instead of two; that three swaps in a row produce a false "switch" mechanism (10 deaths) rather than the idea of a swap; that withholding </w:t>
+        <w:t xml:space="preserve">This work asks whether an LLM-based agent can discover the rules of an unknown world from observation alone, notice when a rule it relied on has silently changed, and revise that rule without wrecking the rest of what it knows. The instrument, AURA, is a curriculum of eleven grid rooms with four unlabeled buttons, two look-alike surfaces (one ends the room, the other returns the agent to the start) and a deflector. Before room 7 the two surfaces silently trade meanings; before room 10 they trade back. The subject (codex, gpt-5.6-luna, sealed) sees only what a person watching the screen would see, presses one button per turn and commits to four checkable predictions before each press; the recovery criterion was fixed before the runs. Result: 11/11 rooms in 116 presses with 4 returns to the start; 95% field accuracy at 97% coverage; both rule changes recovered under the strict criterion (steps 90 and 116), the second revision in this run costing one return instead of two; accuracy on untouched fields did not drop (+1,3 pp). The contribution is the instrument: it separates behavioural success from detection, local revision and retention, audits every observation for lexical leaks, and replays any run from its log. All findings are for one subject with one run per condition. In four single-run variants, a rule held for one room was dropped at one death instead of two; three swaps in a row went with a false "switch" mechanism (10 deaths) rather than the idea of a swap; withholding </w:t>
       </w:r>
       <w:r>
         <w:rPr>
@@ -548,7 +296,7 @@
           <w:color w:val="000000"/>
           <w:sz w:val="24"/>
         </w:rPr>
-        <w:t xml:space="preserve"> lengthens the first revision without hurting acquisition; and that at budget 25 the agent acts on the new rule without predicting it.</w:t>
+        <w:t xml:space="preserve"> lengthened the first revision without hurting acquisition; and at budget 25 the agent acted on the new rule while leaving its predictions about it empty (coverage on altered fields 33% vs 75%).</w:t>
       </w:r>
     </w:p>
     <w:p>
@@ -625,7 +373,7 @@
           <w:i w:val="0"/>
           <w:sz w:val="24"/>
         </w:rPr>
-        <w:t>Актуальность выбранной темы. [ТЕКСТ РУКОВОДИТЕЛЯ]</w:t>
+        <w:t>Актуальность выбранной темы. Агенты на больших языковых моделях всё шире применяются в средах, правила которых им не заданы и могут меняться: в автономной разработке программ, в интерактивных бенчмарках (ARC-AGI-3, 2026). Умение агента заметить, что выученное правило перестало действовать, и пересмотреть именно его — практический вопрос надёжности таких систем, и инструмент, позволяющий это измерить отдельно от успеха, востребован.</w:t>
       </w:r>
     </w:p>
     <w:p>
@@ -640,7 +388,7 @@
           <w:i w:val="0"/>
           <w:sz w:val="24"/>
         </w:rPr>
-        <w:t>Личный вклад автора. [ТЕКСТ РУКОВОДИТЕЛЯ]</w:t>
+        <w:t>Личный вклад автора. Автор сформулировал постановку и исследовательские вопросы, спроектировал учебный план из одиннадцати комнат и механизм скрытой смены правил, реализовал среду, протокол измерений и автоматические проверки с применением инструментов автоматической генерации кода, провёл все прогоны, вёл лабораторный журнал с записью ожиданий до запусков и выполнил анализ журналов.</w:t>
       </w:r>
     </w:p>
     <w:p>
@@ -655,7 +403,7 @@
           <w:i w:val="0"/>
           <w:sz w:val="24"/>
         </w:rPr>
-        <w:t>Сильные стороны исследования. [ТЕКСТ РУКОВОДИТЕЛЯ]</w:t>
+        <w:t>Сильные стороны исследования. Проверяемая гипотеза и критерий восстановления, зафиксированные до запусков; разделение поведенческого успеха и пересмотра знания; детерминированная среда с воспроизведением каждого прогона по журналу и автоматической проверкой отсутствия лексических утечек; честное изложение результатов, которые разошлись с ожиданиями.</w:t>
       </w:r>
     </w:p>
     <w:p>
@@ -670,7 +418,7 @@
           <w:i w:val="0"/>
           <w:sz w:val="24"/>
         </w:rPr>
-        <w:t>Недостатки и ограничения работы. [ТЕКСТ РУКОВОДИТЕЛЯ]</w:t>
+        <w:t>Недостатки и ограничения работы. Один прогон на условие и один субъект, поэтому различия между вариациями нельзя отделить от случайности модели; сеточная абстракция с одним изменяемым правилом; схема ответа частично подсказывает агенту, какие исходы значимы. Ограничения автором осознаны и описаны в работе.</w:t>
       </w:r>
     </w:p>
     <w:p>
@@ -685,7 +433,7 @@
           <w:i w:val="0"/>
           <w:sz w:val="24"/>
         </w:rPr>
-        <w:t>Рекомендации по дальнейшему использованию результатов. [ТЕКСТ РУКОВОДИТЕЛЯ]</w:t>
+        <w:t>Рекомендации по дальнейшему использованию результатов. Провести повторы ключевых условий и добавить контрольный прогон без смены правил; проверить второй субъект через API; опубликовать стенд как открытый инструмент оценки адаптации агентов к нестационарным средам.</w:t>
       </w:r>
     </w:p>
     <w:p>
@@ -1537,7 +1285,7 @@
           <w:color w:val="000000"/>
           <w:sz w:val="24"/>
         </w:rPr>
-        <w:t xml:space="preserve">) строится из состояния движка и содержит только то, что человек увидел бы на экране; отдельная функция проверяет каждое наблюдение на 48 запрещённых слов-основ (rule, swap, lethal, goal и подобные), и прогон останавливается, если хоть одно просочилось. Агент — внешняя модель, вызываемая через адаптер (</w:t>
+        <w:t xml:space="preserve">) строится из состояния движка и содержит только то, что человек увидел бы на экране; отдельная функция проверяет каждое наблюдение на 48 запрещённых слов-основ (rule, swap, lethal, goal и подобные), и прогон останавливается, если хоть одно просочилось; это лексический контроль, структура наблюдения и схемы ответа разбирается отдельно в 2.6. Агент — внешняя модель, вызываемая через адаптер (</w:t>
       </w:r>
       <w:r>
         <w:rPr>
@@ -4353,7 +4101,7 @@
           <w:color w:val="000000"/>
           <w:sz w:val="24"/>
         </w:rPr>
-        <w:t xml:space="preserve">Между ходами стенд не хранит за агента ничего. Память агента — его собственный непрерывный диалог: первое нажатие открывает сеанс codex, каждое следующее возобновляет его по идентификатору, и всё, что агент видел и писал раньше, остаётся перед ним. Стенд лишь возвращает агенту его собственное предсказание с прошлого хода рядом с тем, что произошло, чтобы противоречие было видно без ведения записей. Как именно агент представляет правила (какая кнопка что делает, что делает каждая поверхность, где цель), он решает сам; исследователю это представление доступно через гипотезы и флаги противоречий в каждом ответе.</w:t>
+        <w:t xml:space="preserve">Внешнего хранилища убеждений стенд не ведёт. Память агента — его собственный непрерывный диалог: первое нажатие открывает сеанс codex, каждое следующее возобновляет его по идентификатору, и полная история наблюдений и собственных ответов остаётся доступной агенту в контексте. Единственное, что стенд подставляет от себя, — предсказание агента с прошлого хода рядом с тем, что произошло, чтобы сопоставление не зависело от ведения записей; это вспомогательный элемент памяти, и его абляция (с эхом и без) в работе не проводилась. Как именно агент представляет правила (какая кнопка что делает, что делает каждая поверхность, где цель), он решает сам; исследователю это представление доступно через гипотезы и флаги противоречий в каждом ответе.</w:t>
       </w:r>
     </w:p>
     <w:p>
@@ -4369,7 +4117,7 @@
           <w:color w:val="000000"/>
           <w:sz w:val="24"/>
         </w:rPr>
-        <w:t xml:space="preserve">Такой выбор сделан осознанно. Явное хранилище убеждений  которое агент переписывает каждый ход  добавило бы к измеряемому поведению ещё один слой (что попало в запись  а что нет); с собственным контекстом агента то  что он знает  совпадает с тем  что он видел. Стоимость — рост контекста: в основном прогоне запрос вырос с 12 769 до 82 864 токенов к последнему нажатию  при этом около 98% контекста подавалось из кэша.</w:t>
+        <w:t xml:space="preserve">Такой выбор сделан осознанно. Явное хранилище убеждений  которое агент переписывает каждый ход  добавило бы к измеряемому поведению ещё один слой (что попало в запись  а что нет); с собственным контекстом всё увиденное остаётся доступным  хотя доступность не означает  что агент это верно истолковал или удержал. Стоимость — рост контекста: в основном прогоне запрос вырос с 12 769 до 82 864 токенов к последнему нажатию  при этом около 98% контекста подавалось из кэша.</w:t>
       </w:r>
     </w:p>
     <w:p>
@@ -4418,7 +4166,7 @@
           <w:color w:val="000000"/>
           <w:sz w:val="24"/>
         </w:rPr>
-        <w:t xml:space="preserve">Утечка исключается тремя способами. Наблюдение не содержит поля с причиной: результат нажатия описан позициями, а не событиями («погиб», «достиг цели»). Каждое наблюдение проверяется на 48 запрещённых основ слов; проверка прогоняется и по всем достижимым состояниям всех комнат при сборке. Схема ответа не называет событий: агент предсказывает клетку и три булевых поля, а не «умру ли я». Отдельная проверка гарантирует, что в комнатах 7 и 10 маршрут, верный до смены, после неё смертелен, а маршрут, верный после, смертелен до, и что верный после смены маршрут короче: не пересмотреть правило должно стоить дороже, чем пересмотреть.</w:t>
+        <w:t xml:space="preserve">Лексическая утечка исключается тремя способами. Наблюдение не содержит поля с причиной: результат нажатия описан позициями, а не событиями («погиб», «достиг цели»). Каждое наблюдение проверяется на 48 запрещённых основ слов; проверка прогоняется и по всем достижимым состояниям всех комнат при сборке. Схема ответа не содержит скрытых причин и семантических меток (цель, опасность, смена): она содержит проверяемые отношения между наблюдаемыми состояниями, в том числе возврат на стартовую клетку и смену комнаты. Это осознанное допущение: два из четырёх полей выделяют именно те исходы, которые различают поверхности, и тем самым подсказывают агенту, за чем следить, хотя и не говорят, что именно их вызывает; ограничение обсуждается в 4.5. Отдельная проверка гарантирует, что в комнатах 7 и 10 маршрут, верный до смены, после неё смертелен, а маршрут, верный после, смертелен до, и что верный после смены маршрут короче: не пересмотреть правило должно стоить дороже, чем пересмотреть.</w:t>
       </w:r>
     </w:p>
     <w:p>
@@ -4451,7 +4199,7 @@
           <w:color w:val="000000"/>
           <w:sz w:val="24"/>
         </w:rPr>
-        <w:t>2.7. Сравниваемые условия / baselines</w:t>
+        <w:t>2.7. Экспериментальные условия и абляции</w:t>
       </w:r>
     </w:p>
     <w:p>
@@ -4571,7 +4319,7 @@
           <w:color w:val="000000"/>
           <w:sz w:val="24"/>
         </w:rPr>
-        <w:t xml:space="preserve">Оракул (агент, знающий правила) не используется: его роль выполняет эталонная длина пути по поиску в ширину, с которой сравнивается число нажатий в каждой комнате. Все прогоны выполнены одним субъектом; результаты разных моделей в работе не смешиваются.</w:t>
+        <w:t xml:space="preserve">Это вариации и абляции одного и того же агента, а не отдельные baseline-агенты; контрольного прогона без смены правил в работе нет. Эталонная длина пути по поиску в ширину служит нижней границей по числу действий, а не образцом поведения. Все прогоны выполнены одним субъектом, по одному на условие; результаты разных моделей в работе не смешиваются.</w:t>
       </w:r>
     </w:p>
     <w:p>
@@ -4756,7 +4504,7 @@
           <w:color w:val="000000"/>
           <w:sz w:val="24"/>
         </w:rPr>
-        <w:t xml:space="preserve">– точность предсказаний: доля верных проверяемых полей среди тех, к которым агент обязался;</w:t>
+        <w:t xml:space="preserve">– точность предсказаний: доля верных проверяемых полей среди тех, к которым агент обязался; полнота (coverage): доля заполненных полей среди доступных, отдельно по полям, которые смена изменила, — без неё точность можно поднять простым отказом от ответа;</w:t>
       </w:r>
     </w:p>
     <w:p>
@@ -4874,7 +4622,7 @@
           <w:color w:val="000000"/>
           <w:sz w:val="24"/>
         </w:rPr>
-        <w:t xml:space="preserve">Каждая смена оценивается отдельно, так что для второй смены есть свой набор тех же чисел. Критерий восстановления зафиксирован до первого прогона; строгий вариант R1 добавлен после первого прогона на восьмикомнатной версии стенда, когда выяснилось, что нестрогий засчитывает нажатие, в котором одно поле угадано, а два предсказаны по мёртвому правилу.</w:t>
+        <w:t xml:space="preserve">Каждая смена оценивается отдельно, так что для второй смены есть свой набор тех же чисел. Критерий восстановления зафиксирован до первого прогона. Строгий вариант R1 добавлен после пилотного прогона на восьмикомнатной версии стенда (движок v4), когда выяснилось, что нестрогий засчитывает нажатие, в котором одно поле угадано, а два предсказаны по мёртвому правилу; он заморожен до основного прогона на одиннадцати комнатах, и пилотный прогон в результаты не входит.</w:t>
       </w:r>
     </w:p>
     <w:p>
@@ -7080,7 +6828,7 @@
           <w:color w:val="000000"/>
           <w:sz w:val="24"/>
         </w:rPr>
-        <w:t xml:space="preserve">Комнаты 1 и 2 пройдены по кратчайшему пути (по 4 нажатия), все поля предсказаны верно. В комнате 1 агент проверил две кнопки и на четвёртом нажатии предсказал: «reaches the concentric tile and advances to another room». В комнате 2 клетка (3,2), бывшая целью в комнате 1, названа «the square directly below the concentric tile», и агент не ожидал от неё ничего. Комната 3: второе нажатие привело на спицы и вернуло на старт; следующий ответ (шаг 11) содержит флаг противоречия «Stepping onto the radial tile reset the entity to the room’s starting square instead of leaving it there» и гипотезу обхода, после чего шесть нажатий обхода прошли без единой ошибки. Единственная поверхность, которую агент так и не предсказал, — отражатель: в комнате 5 (шаг 28) он ожидал остаться на клетке отражателя и оказался на соседней, а следующим ходом описал перенос верно.</w:t>
+        <w:t xml:space="preserve">Полнота ответов за прогон 97% (0 нажатий без обязательств), на изменённых сменой полях — 75%. Комнаты 1 и 2 пройдены по кратчайшему пути (по 4 нажатия), все поля предсказаны верно. В комнате 1 агент проверил две кнопки и на четвёртом нажатии предсказал: «reaches the concentric tile and advances to another room». В комнате 2 клетка (3,2), бывшая целью в комнате 1, названа «the square directly below the concentric tile», и агент не ожидал от неё ничего. Комната 3: второе нажатие привело на спицы и вернуло на старт; следующий ответ (шаг 11) содержит флаг противоречия «Stepping onto the radial tile reset the entity to the room’s starting square instead of leaving it there» и гипотезу обхода, после чего шесть нажатий обхода прошли без единой ошибки. Единственная поверхность, которую агент так и не предсказал, — отражатель: в комнате 5 (шаг 28) он ожидал остаться на клетке отражателя и оказался на соседней, а следующим ходом описал перенос верно.</w:t>
       </w:r>
     </w:p>
     <w:p>
@@ -7915,7 +7663,7 @@
           <w:color w:val="000000"/>
           <w:sz w:val="24"/>
         </w:rPr>
-        <w:t xml:space="preserve">Точность по полям, которых смена не касалась, составила 97% до первой смены и 99% после неё, то есть после смены она на 1 п.п. выше, а не ниже. Кнопки, стены и отражатель после смены предсказывались так же, как до: все ошибки после смены, кроме двух на отражателе, пришлись на поля, которые смена изменила. Ни одно нажатие после смены не было заблокировано стеной по ошибке в направлении.</w:t>
+        <w:t xml:space="preserve">Точность по полям, которых смена не касалась, составила 97,4% до первой смены и 98,7% после неё (+1,3 п.п.). Кнопки, стены и отражатель после смены предсказывались так же, как до: все ошибки после смены, кроме двух на отражателе, пришлись на поля, которые смена изменила. Ни одно нажатие после смены не было заблокировано стеной по ошибке в направлении.</w:t>
       </w:r>
     </w:p>
     <w:p>
@@ -7932,7 +7680,7 @@
           <w:color w:val="000000"/>
           <w:sz w:val="24"/>
         </w:rPr>
-        <w:t>3.6. Сравнение с baseline-условиями</w:t>
+        <w:t>3.6. Сравнение экспериментальных условий</w:t>
       </w:r>
     </w:p>
     <w:p>
@@ -7970,12 +7718,13 @@
         </w:tblCellMar>
       </w:tblPr>
       <w:tblGrid>
-        <w:gridCol w:w="2100"/>
-        <w:gridCol w:w="800"/>
+        <w:gridCol w:w="2300"/>
         <w:gridCol w:w="900"/>
-        <w:gridCol w:w="900"/>
-        <w:gridCol w:w="1100"/>
-        <w:gridCol w:w="3600"/>
+        <w:gridCol w:w="1000"/>
+        <w:gridCol w:w="1000"/>
+        <w:gridCol w:w="1300"/>
+        <w:gridCol w:w="1300"/>
+        <w:gridCol w:w="1600"/>
       </w:tblGrid>
       <w:tr>
         <w:trPr>
@@ -7983,7 +7732,7 @@
         </w:trPr>
         <w:tc>
           <w:tcPr>
-            <w:tcW w:w="2100" w:type="dxa"/>
+            <w:tcW w:w="2300" w:type="dxa"/>
             <w:shd w:val="clear" w:color="auto" w:fill="EDEDED"/>
             <w:vAlign w:val="center"/>
           </w:tcPr>
@@ -8006,7 +7755,7 @@
         </w:tc>
         <w:tc>
           <w:tcPr>
-            <w:tcW w:w="800" w:type="dxa"/>
+            <w:tcW w:w="900" w:type="dxa"/>
             <w:shd w:val="clear" w:color="auto" w:fill="EDEDED"/>
             <w:vAlign w:val="center"/>
           </w:tcPr>
@@ -8029,7 +7778,7 @@
         </w:tc>
         <w:tc>
           <w:tcPr>
-            <w:tcW w:w="900" w:type="dxa"/>
+            <w:tcW w:w="1000" w:type="dxa"/>
             <w:shd w:val="clear" w:color="auto" w:fill="EDEDED"/>
             <w:vAlign w:val="center"/>
           </w:tcPr>
@@ -8052,7 +7801,7 @@
         </w:tc>
         <w:tc>
           <w:tcPr>
-            <w:tcW w:w="900" w:type="dxa"/>
+            <w:tcW w:w="1000" w:type="dxa"/>
             <w:shd w:val="clear" w:color="auto" w:fill="EDEDED"/>
             <w:vAlign w:val="center"/>
           </w:tcPr>
@@ -8075,7 +7824,7 @@
         </w:tc>
         <w:tc>
           <w:tcPr>
-            <w:tcW w:w="1100" w:type="dxa"/>
+            <w:tcW w:w="1300" w:type="dxa"/>
             <w:shd w:val="clear" w:color="auto" w:fill="EDEDED"/>
             <w:vAlign w:val="center"/>
           </w:tcPr>
@@ -8098,7 +7847,7 @@
         </w:tc>
         <w:tc>
           <w:tcPr>
-            <w:tcW w:w="3600" w:type="dxa"/>
+            <w:tcW w:w="1300" w:type="dxa"/>
             <w:shd w:val="clear" w:color="auto" w:fill="EDEDED"/>
             <w:vAlign w:val="center"/>
           </w:tcPr>
@@ -8115,7 +7864,30 @@
                 <w:color w:val="000000"/>
                 <w:sz w:val="18"/>
               </w:rPr>
-              <w:t xml:space="preserve">нажатий по комнатам (†гибели)</w:t>
+              <w:t xml:space="preserve">полнота ответов</w:t>
+            </w:r>
+          </w:p>
+        </w:tc>
+        <w:tc>
+          <w:tcPr>
+            <w:tcW w:w="1600" w:type="dxa"/>
+            <w:shd w:val="clear" w:color="auto" w:fill="EDEDED"/>
+            <w:vAlign w:val="center"/>
+          </w:tcPr>
+          <w:p>
+            <w:pPr>
+              <w:spacing w:before="20" w:after="20" w:line="240" w:lineRule="auto"/>
+              <w:jc w:val="center"/>
+            </w:pPr>
+            <w:r>
+              <w:rPr>
+                <w:rFonts w:ascii="Times New Roman" w:hAnsi="Times New Roman" w:eastAsia="Times New Roman" w:cs="Times New Roman"/>
+                <w:b/>
+                <w:i w:val="0"/>
+                <w:color w:val="000000"/>
+                <w:sz w:val="18"/>
+              </w:rPr>
+              <w:t xml:space="preserve">полнота на изменённых полях</w:t>
             </w:r>
           </w:p>
         </w:tc>
@@ -8123,7 +7895,7 @@
       <w:tr>
         <w:tc>
           <w:tcPr>
-            <w:tcW w:w="2100" w:type="dxa"/>
+            <w:tcW w:w="2300" w:type="dxa"/>
             <w:vAlign w:val="center"/>
           </w:tcPr>
           <w:p>
@@ -8145,7 +7917,7 @@
         </w:tc>
         <w:tc>
           <w:tcPr>
-            <w:tcW w:w="800" w:type="dxa"/>
+            <w:tcW w:w="900" w:type="dxa"/>
             <w:vAlign w:val="center"/>
           </w:tcPr>
           <w:p>
@@ -8167,7 +7939,7 @@
         </w:tc>
         <w:tc>
           <w:tcPr>
-            <w:tcW w:w="900" w:type="dxa"/>
+            <w:tcW w:w="1000" w:type="dxa"/>
             <w:vAlign w:val="center"/>
           </w:tcPr>
           <w:p>
@@ -8189,7 +7961,7 @@
         </w:tc>
         <w:tc>
           <w:tcPr>
-            <w:tcW w:w="900" w:type="dxa"/>
+            <w:tcW w:w="1000" w:type="dxa"/>
             <w:vAlign w:val="center"/>
           </w:tcPr>
           <w:p>
@@ -8211,7 +7983,7 @@
         </w:tc>
         <w:tc>
           <w:tcPr>
-            <w:tcW w:w="1100" w:type="dxa"/>
+            <w:tcW w:w="1300" w:type="dxa"/>
             <w:vAlign w:val="center"/>
           </w:tcPr>
           <w:p>
@@ -8233,7 +8005,7 @@
         </w:tc>
         <w:tc>
           <w:tcPr>
-            <w:tcW w:w="3600" w:type="dxa"/>
+            <w:tcW w:w="1300" w:type="dxa"/>
             <w:vAlign w:val="center"/>
           </w:tcPr>
           <w:p>
@@ -8249,7 +8021,29 @@
                 <w:color w:val="000000"/>
                 <w:sz w:val="18"/>
               </w:rPr>
-              <w:t xml:space="preserve">4 · 4 · 8†1 · 5 · 9 · 23 · 16†1 · 21†1 · 8 · 7 · 11†1</w:t>
+              <w:t xml:space="preserve">97%</w:t>
+            </w:r>
+          </w:p>
+        </w:tc>
+        <w:tc>
+          <w:tcPr>
+            <w:tcW w:w="1600" w:type="dxa"/>
+            <w:vAlign w:val="center"/>
+          </w:tcPr>
+          <w:p>
+            <w:pPr>
+              <w:spacing w:before="20" w:after="20" w:line="240" w:lineRule="auto"/>
+              <w:jc w:val="left"/>
+            </w:pPr>
+            <w:r>
+              <w:rPr>
+                <w:rFonts w:ascii="Times New Roman" w:hAnsi="Times New Roman" w:eastAsia="Times New Roman" w:cs="Times New Roman"/>
+                <w:b w:val="0"/>
+                <w:i w:val="0"/>
+                <w:color w:val="000000"/>
+                <w:sz w:val="18"/>
+              </w:rPr>
+              <w:t xml:space="preserve">75%</w:t>
             </w:r>
           </w:p>
         </w:tc>
@@ -8257,7 +8051,7 @@
       <w:tr>
         <w:tc>
           <w:tcPr>
-            <w:tcW w:w="2100" w:type="dxa"/>
+            <w:tcW w:w="2300" w:type="dxa"/>
             <w:vAlign w:val="center"/>
           </w:tcPr>
           <w:p>
@@ -8279,7 +8073,7 @@
         </w:tc>
         <w:tc>
           <w:tcPr>
-            <w:tcW w:w="800" w:type="dxa"/>
+            <w:tcW w:w="900" w:type="dxa"/>
             <w:vAlign w:val="center"/>
           </w:tcPr>
           <w:p>
@@ -8301,7 +8095,7 @@
         </w:tc>
         <w:tc>
           <w:tcPr>
-            <w:tcW w:w="900" w:type="dxa"/>
+            <w:tcW w:w="1000" w:type="dxa"/>
             <w:vAlign w:val="center"/>
           </w:tcPr>
           <w:p>
@@ -8323,7 +8117,7 @@
         </w:tc>
         <w:tc>
           <w:tcPr>
-            <w:tcW w:w="900" w:type="dxa"/>
+            <w:tcW w:w="1000" w:type="dxa"/>
             <w:vAlign w:val="center"/>
           </w:tcPr>
           <w:p>
@@ -8345,7 +8139,7 @@
         </w:tc>
         <w:tc>
           <w:tcPr>
-            <w:tcW w:w="1100" w:type="dxa"/>
+            <w:tcW w:w="1300" w:type="dxa"/>
             <w:vAlign w:val="center"/>
           </w:tcPr>
           <w:p>
@@ -8367,7 +8161,7 @@
         </w:tc>
         <w:tc>
           <w:tcPr>
-            <w:tcW w:w="3600" w:type="dxa"/>
+            <w:tcW w:w="1300" w:type="dxa"/>
             <w:vAlign w:val="center"/>
           </w:tcPr>
           <w:p>
@@ -8383,7 +8177,29 @@
                 <w:color w:val="000000"/>
                 <w:sz w:val="18"/>
               </w:rPr>
-              <w:t xml:space="preserve">8 · 4 · 8†1 · 10†1 · 2 · 22 · 4 · 10 · 8 · 31†1 · 11†1</w:t>
+              <w:t xml:space="preserve">96%</w:t>
+            </w:r>
+          </w:p>
+        </w:tc>
+        <w:tc>
+          <w:tcPr>
+            <w:tcW w:w="1600" w:type="dxa"/>
+            <w:vAlign w:val="center"/>
+          </w:tcPr>
+          <w:p>
+            <w:pPr>
+              <w:spacing w:before="20" w:after="20" w:line="240" w:lineRule="auto"/>
+              <w:jc w:val="left"/>
+            </w:pPr>
+            <w:r>
+              <w:rPr>
+                <w:rFonts w:ascii="Times New Roman" w:hAnsi="Times New Roman" w:eastAsia="Times New Roman" w:cs="Times New Roman"/>
+                <w:b w:val="0"/>
+                <w:i w:val="0"/>
+                <w:color w:val="000000"/>
+                <w:sz w:val="18"/>
+              </w:rPr>
+              <w:t xml:space="preserve">67%</w:t>
             </w:r>
           </w:p>
         </w:tc>
@@ -8391,7 +8207,7 @@
       <w:tr>
         <w:tc>
           <w:tcPr>
-            <w:tcW w:w="2100" w:type="dxa"/>
+            <w:tcW w:w="2300" w:type="dxa"/>
             <w:vAlign w:val="center"/>
           </w:tcPr>
           <w:p>
@@ -8413,7 +8229,7 @@
         </w:tc>
         <w:tc>
           <w:tcPr>
-            <w:tcW w:w="800" w:type="dxa"/>
+            <w:tcW w:w="900" w:type="dxa"/>
             <w:vAlign w:val="center"/>
           </w:tcPr>
           <w:p>
@@ -8435,7 +8251,7 @@
         </w:tc>
         <w:tc>
           <w:tcPr>
-            <w:tcW w:w="900" w:type="dxa"/>
+            <w:tcW w:w="1000" w:type="dxa"/>
             <w:vAlign w:val="center"/>
           </w:tcPr>
           <w:p>
@@ -8457,7 +8273,7 @@
         </w:tc>
         <w:tc>
           <w:tcPr>
-            <w:tcW w:w="900" w:type="dxa"/>
+            <w:tcW w:w="1000" w:type="dxa"/>
             <w:vAlign w:val="center"/>
           </w:tcPr>
           <w:p>
@@ -8479,7 +8295,7 @@
         </w:tc>
         <w:tc>
           <w:tcPr>
-            <w:tcW w:w="1100" w:type="dxa"/>
+            <w:tcW w:w="1300" w:type="dxa"/>
             <w:vAlign w:val="center"/>
           </w:tcPr>
           <w:p>
@@ -8501,7 +8317,7 @@
         </w:tc>
         <w:tc>
           <w:tcPr>
-            <w:tcW w:w="3600" w:type="dxa"/>
+            <w:tcW w:w="1300" w:type="dxa"/>
             <w:vAlign w:val="center"/>
           </w:tcPr>
           <w:p>
@@ -8517,7 +8333,29 @@
                 <w:color w:val="000000"/>
                 <w:sz w:val="18"/>
               </w:rPr>
-              <w:t xml:space="preserve">4 · 4 · 8†1 · 17†2 · 11†1 · 20 · 15†1 · 69†4 · 13†1 · 13 · 3</w:t>
+              <w:t xml:space="preserve">96%</w:t>
+            </w:r>
+          </w:p>
+        </w:tc>
+        <w:tc>
+          <w:tcPr>
+            <w:tcW w:w="1600" w:type="dxa"/>
+            <w:vAlign w:val="center"/>
+          </w:tcPr>
+          <w:p>
+            <w:pPr>
+              <w:spacing w:before="20" w:after="20" w:line="240" w:lineRule="auto"/>
+              <w:jc w:val="left"/>
+            </w:pPr>
+            <w:r>
+              <w:rPr>
+                <w:rFonts w:ascii="Times New Roman" w:hAnsi="Times New Roman" w:eastAsia="Times New Roman" w:cs="Times New Roman"/>
+                <w:b w:val="0"/>
+                <w:i w:val="0"/>
+                <w:color w:val="000000"/>
+                <w:sz w:val="18"/>
+              </w:rPr>
+              <w:t xml:space="preserve">67%</w:t>
             </w:r>
           </w:p>
         </w:tc>
@@ -8525,7 +8363,7 @@
       <w:tr>
         <w:tc>
           <w:tcPr>
-            <w:tcW w:w="2100" w:type="dxa"/>
+            <w:tcW w:w="2300" w:type="dxa"/>
             <w:vAlign w:val="center"/>
           </w:tcPr>
           <w:p>
@@ -8547,7 +8385,7 @@
         </w:tc>
         <w:tc>
           <w:tcPr>
-            <w:tcW w:w="800" w:type="dxa"/>
+            <w:tcW w:w="900" w:type="dxa"/>
             <w:vAlign w:val="center"/>
           </w:tcPr>
           <w:p>
@@ -8569,7 +8407,7 @@
         </w:tc>
         <w:tc>
           <w:tcPr>
-            <w:tcW w:w="900" w:type="dxa"/>
+            <w:tcW w:w="1000" w:type="dxa"/>
             <w:vAlign w:val="center"/>
           </w:tcPr>
           <w:p>
@@ -8591,7 +8429,7 @@
         </w:tc>
         <w:tc>
           <w:tcPr>
-            <w:tcW w:w="900" w:type="dxa"/>
+            <w:tcW w:w="1000" w:type="dxa"/>
             <w:vAlign w:val="center"/>
           </w:tcPr>
           <w:p>
@@ -8613,7 +8451,7 @@
         </w:tc>
         <w:tc>
           <w:tcPr>
-            <w:tcW w:w="1100" w:type="dxa"/>
+            <w:tcW w:w="1300" w:type="dxa"/>
             <w:vAlign w:val="center"/>
           </w:tcPr>
           <w:p>
@@ -8635,7 +8473,7 @@
         </w:tc>
         <w:tc>
           <w:tcPr>
-            <w:tcW w:w="3600" w:type="dxa"/>
+            <w:tcW w:w="1300" w:type="dxa"/>
             <w:vAlign w:val="center"/>
           </w:tcPr>
           <w:p>
@@ -8651,7 +8489,29 @@
                 <w:color w:val="000000"/>
                 <w:sz w:val="18"/>
               </w:rPr>
-              <w:t xml:space="preserve">4 · 4 · 8†1 · 5 · 12 · 25 · 27†1 · 21†1 · 8 · 20†1 · 8</w:t>
+              <w:t xml:space="preserve">97%</w:t>
+            </w:r>
+          </w:p>
+        </w:tc>
+        <w:tc>
+          <w:tcPr>
+            <w:tcW w:w="1600" w:type="dxa"/>
+            <w:vAlign w:val="center"/>
+          </w:tcPr>
+          <w:p>
+            <w:pPr>
+              <w:spacing w:before="20" w:after="20" w:line="240" w:lineRule="auto"/>
+              <w:jc w:val="left"/>
+            </w:pPr>
+            <w:r>
+              <w:rPr>
+                <w:rFonts w:ascii="Times New Roman" w:hAnsi="Times New Roman" w:eastAsia="Times New Roman" w:cs="Times New Roman"/>
+                <w:b w:val="0"/>
+                <w:i w:val="0"/>
+                <w:color w:val="000000"/>
+                <w:sz w:val="18"/>
+              </w:rPr>
+              <w:t xml:space="preserve">67%</w:t>
             </w:r>
           </w:p>
         </w:tc>
@@ -8659,7 +8519,7 @@
       <w:tr>
         <w:tc>
           <w:tcPr>
-            <w:tcW w:w="2100" w:type="dxa"/>
+            <w:tcW w:w="2300" w:type="dxa"/>
             <w:vAlign w:val="center"/>
           </w:tcPr>
           <w:p>
@@ -8681,7 +8541,7 @@
         </w:tc>
         <w:tc>
           <w:tcPr>
-            <w:tcW w:w="800" w:type="dxa"/>
+            <w:tcW w:w="900" w:type="dxa"/>
             <w:vAlign w:val="center"/>
           </w:tcPr>
           <w:p>
@@ -8703,7 +8563,7 @@
         </w:tc>
         <w:tc>
           <w:tcPr>
-            <w:tcW w:w="900" w:type="dxa"/>
+            <w:tcW w:w="1000" w:type="dxa"/>
             <w:vAlign w:val="center"/>
           </w:tcPr>
           <w:p>
@@ -8725,7 +8585,7 @@
         </w:tc>
         <w:tc>
           <w:tcPr>
-            <w:tcW w:w="900" w:type="dxa"/>
+            <w:tcW w:w="1000" w:type="dxa"/>
             <w:vAlign w:val="center"/>
           </w:tcPr>
           <w:p>
@@ -8747,7 +8607,7 @@
         </w:tc>
         <w:tc>
           <w:tcPr>
-            <w:tcW w:w="1100" w:type="dxa"/>
+            <w:tcW w:w="1300" w:type="dxa"/>
             <w:vAlign w:val="center"/>
           </w:tcPr>
           <w:p>
@@ -8769,7 +8629,7 @@
         </w:tc>
         <w:tc>
           <w:tcPr>
-            <w:tcW w:w="3600" w:type="dxa"/>
+            <w:tcW w:w="1300" w:type="dxa"/>
             <w:vAlign w:val="center"/>
           </w:tcPr>
           <w:p>
@@ -8785,7 +8645,29 @@
                 <w:color w:val="000000"/>
                 <w:sz w:val="18"/>
               </w:rPr>
-              <w:t xml:space="preserve">4 · 4 · 8†1 · 5 · 9 · 25 · 15†1 · 11 · 10†1 · 7 · 8</w:t>
+              <w:t xml:space="preserve">95%</w:t>
+            </w:r>
+          </w:p>
+        </w:tc>
+        <w:tc>
+          <w:tcPr>
+            <w:tcW w:w="1600" w:type="dxa"/>
+            <w:vAlign w:val="center"/>
+          </w:tcPr>
+          <w:p>
+            <w:pPr>
+              <w:spacing w:before="20" w:after="20" w:line="240" w:lineRule="auto"/>
+              <w:jc w:val="left"/>
+            </w:pPr>
+            <w:r>
+              <w:rPr>
+                <w:rFonts w:ascii="Times New Roman" w:hAnsi="Times New Roman" w:eastAsia="Times New Roman" w:cs="Times New Roman"/>
+                <w:b w:val="0"/>
+                <w:i w:val="0"/>
+                <w:color w:val="000000"/>
+                <w:sz w:val="18"/>
+              </w:rPr>
+              <w:t xml:space="preserve">33%</w:t>
             </w:r>
           </w:p>
         </w:tc>
@@ -8810,12 +8692,12 @@
           <w:color w:val="000000"/>
           <w:sz w:val="20"/>
         </w:rPr>
-        <w:t xml:space="preserve">Табл. 4. Пять прогонов. Вариация D потеряла комнату 6 по бюджету (25 нажатий при эталоне 19, без гибели).</w:t>
+        <w:t xml:space="preserve">Табл. 4. Пять прогонов. Полнота — доля заполненных проверяемых полей; на изменённых полях считается только по различающим нажатиям после смены. Нажатия по комнатам — рис. 7.</w:t>
       </w:r>
     </w:p>
     <w:tbl>
       <w:tblPr>
-        <w:tblW w:w="9300" w:type="dxa"/>
+        <w:tblW w:w="9700" w:type="dxa"/>
         <w:jc w:val="center"/>
         <w:tblBorders>
           <w:top w:val="single" w:sz="4" w:space="0" w:color="000000"/>
@@ -8832,12 +8714,11 @@
         </w:tblCellMar>
       </w:tblPr>
       <w:tblGrid>
-        <w:gridCol w:w="900"/>
+        <w:gridCol w:w="1000"/>
+        <w:gridCol w:w="1500"/>
         <w:gridCol w:w="1200"/>
-        <w:gridCol w:w="1200"/>
-        <w:gridCol w:w="800"/>
-        <w:gridCol w:w="1100"/>
-        <w:gridCol w:w="1000"/>
+        <w:gridCol w:w="1500"/>
+        <w:gridCol w:w="1400"/>
         <w:gridCol w:w="1800"/>
         <w:gridCol w:w="1300"/>
       </w:tblGrid>
@@ -8847,7 +8728,7 @@
         </w:trPr>
         <w:tc>
           <w:tcPr>
-            <w:tcW w:w="900" w:type="dxa"/>
+            <w:tcW w:w="1000" w:type="dxa"/>
             <w:shd w:val="clear" w:color="auto" w:fill="EDEDED"/>
             <w:vAlign w:val="center"/>
           </w:tcPr>
@@ -8870,7 +8751,7 @@
         </w:tc>
         <w:tc>
           <w:tcPr>
-            <w:tcW w:w="1200" w:type="dxa"/>
+            <w:tcW w:w="1500" w:type="dxa"/>
             <w:shd w:val="clear" w:color="auto" w:fill="EDEDED"/>
             <w:vAlign w:val="center"/>
           </w:tcPr>
@@ -8910,13 +8791,13 @@
                 <w:color w:val="000000"/>
                 <w:sz w:val="18"/>
               </w:rPr>
-              <w:t xml:space="preserve">свидетельство</w:t>
+              <w:t xml:space="preserve">R2 (шаг)</w:t>
             </w:r>
           </w:p>
         </w:tc>
         <w:tc>
           <w:tcPr>
-            <w:tcW w:w="800" w:type="dxa"/>
+            <w:tcW w:w="1500" w:type="dxa"/>
             <w:shd w:val="clear" w:color="auto" w:fill="EDEDED"/>
             <w:vAlign w:val="center"/>
           </w:tcPr>
@@ -8933,13 +8814,13 @@
                 <w:color w:val="000000"/>
                 <w:sz w:val="18"/>
               </w:rPr>
-              <w:t xml:space="preserve">R2</w:t>
+              <w:t xml:space="preserve">строгий R1 (шаг)</w:t>
             </w:r>
           </w:p>
         </w:tc>
         <w:tc>
           <w:tcPr>
-            <w:tcW w:w="1100" w:type="dxa"/>
+            <w:tcW w:w="1400" w:type="dxa"/>
             <w:shd w:val="clear" w:color="auto" w:fill="EDEDED"/>
             <w:vAlign w:val="center"/>
           </w:tcPr>
@@ -8956,30 +8837,7 @@
                 <w:color w:val="000000"/>
                 <w:sz w:val="18"/>
               </w:rPr>
-              <w:t xml:space="preserve">строгий R1</w:t>
-            </w:r>
-          </w:p>
-        </w:tc>
-        <w:tc>
-          <w:tcPr>
-            <w:tcW w:w="1000" w:type="dxa"/>
-            <w:shd w:val="clear" w:color="auto" w:fill="EDEDED"/>
-            <w:vAlign w:val="center"/>
-          </w:tcPr>
-          <w:p>
-            <w:pPr>
-              <w:spacing w:before="20" w:after="20" w:line="240" w:lineRule="auto"/>
-              <w:jc w:val="center"/>
-            </w:pPr>
-            <w:r>
-              <w:rPr>
-                <w:rFonts w:ascii="Times New Roman" w:hAnsi="Times New Roman" w:eastAsia="Times New Roman" w:cs="Times New Roman"/>
-                <w:b/>
-                <w:i w:val="0"/>
-                <w:color w:val="000000"/>
-                <w:sz w:val="18"/>
-              </w:rPr>
-              <w:t xml:space="preserve">задержка</w:t>
+              <w:t xml:space="preserve">задержка, нажатий</w:t>
             </w:r>
           </w:p>
         </w:tc>
@@ -9025,7 +8883,7 @@
                 <w:color w:val="000000"/>
                 <w:sz w:val="18"/>
               </w:rPr>
-              <w:t xml:space="preserve">восстановлен</w:t>
+              <w:t xml:space="preserve">восстановлена</w:t>
             </w:r>
           </w:p>
         </w:tc>
@@ -9033,7 +8891,7 @@
       <w:tr>
         <w:tc>
           <w:tcPr>
-            <w:tcW w:w="900" w:type="dxa"/>
+            <w:tcW w:w="1000" w:type="dxa"/>
             <w:vAlign w:val="center"/>
           </w:tcPr>
           <w:p>
@@ -9055,7 +8913,7 @@
         </w:tc>
         <w:tc>
           <w:tcPr>
-            <w:tcW w:w="1200" w:type="dxa"/>
+            <w:tcW w:w="1500" w:type="dxa"/>
             <w:vAlign w:val="center"/>
           </w:tcPr>
           <w:p>
@@ -9093,35 +8951,13 @@
                 <w:color w:val="000000"/>
                 <w:sz w:val="18"/>
               </w:rPr>
-              <w:t xml:space="preserve">65</w:t>
-            </w:r>
-          </w:p>
-        </w:tc>
-        <w:tc>
-          <w:tcPr>
-            <w:tcW w:w="800" w:type="dxa"/>
-            <w:vAlign w:val="center"/>
-          </w:tcPr>
-          <w:p>
-            <w:pPr>
-              <w:spacing w:before="20" w:after="20" w:line="240" w:lineRule="auto"/>
-              <w:jc w:val="left"/>
-            </w:pPr>
-            <w:r>
-              <w:rPr>
-                <w:rFonts w:ascii="Times New Roman" w:hAnsi="Times New Roman" w:eastAsia="Times New Roman" w:cs="Times New Roman"/>
-                <w:b w:val="0"/>
-                <w:i w:val="0"/>
-                <w:color w:val="000000"/>
-                <w:sz w:val="18"/>
-              </w:rPr>
               <w:t xml:space="preserve">69</w:t>
             </w:r>
           </w:p>
         </w:tc>
         <w:tc>
           <w:tcPr>
-            <w:tcW w:w="1100" w:type="dxa"/>
+            <w:tcW w:w="1500" w:type="dxa"/>
             <w:vAlign w:val="center"/>
           </w:tcPr>
           <w:p>
@@ -9143,7 +8979,7 @@
         </w:tc>
         <w:tc>
           <w:tcPr>
-            <w:tcW w:w="1000" w:type="dxa"/>
+            <w:tcW w:w="1400" w:type="dxa"/>
             <w:vAlign w:val="center"/>
           </w:tcPr>
           <w:p>
@@ -9211,7 +9047,7 @@
       <w:tr>
         <w:tc>
           <w:tcPr>
-            <w:tcW w:w="900" w:type="dxa"/>
+            <w:tcW w:w="1000" w:type="dxa"/>
             <w:vAlign w:val="center"/>
           </w:tcPr>
           <w:p>
@@ -9233,7 +9069,7 @@
         </w:tc>
         <w:tc>
           <w:tcPr>
-            <w:tcW w:w="1200" w:type="dxa"/>
+            <w:tcW w:w="1500" w:type="dxa"/>
             <w:vAlign w:val="center"/>
           </w:tcPr>
           <w:p>
@@ -9277,29 +9113,7 @@
         </w:tc>
         <w:tc>
           <w:tcPr>
-            <w:tcW w:w="800" w:type="dxa"/>
-            <w:vAlign w:val="center"/>
-          </w:tcPr>
-          <w:p>
-            <w:pPr>
-              <w:spacing w:before="20" w:after="20" w:line="240" w:lineRule="auto"/>
-              <w:jc w:val="left"/>
-            </w:pPr>
-            <w:r>
-              <w:rPr>
-                <w:rFonts w:ascii="Times New Roman" w:hAnsi="Times New Roman" w:eastAsia="Times New Roman" w:cs="Times New Roman"/>
-                <w:b w:val="0"/>
-                <w:i w:val="0"/>
-                <w:color w:val="000000"/>
-                <w:sz w:val="18"/>
-              </w:rPr>
-              <w:t xml:space="preserve">105</w:t>
-            </w:r>
-          </w:p>
-        </w:tc>
-        <w:tc>
-          <w:tcPr>
-            <w:tcW w:w="1100" w:type="dxa"/>
+            <w:tcW w:w="1500" w:type="dxa"/>
             <w:vAlign w:val="center"/>
           </w:tcPr>
           <w:p>
@@ -9321,7 +9135,7 @@
         </w:tc>
         <w:tc>
           <w:tcPr>
-            <w:tcW w:w="1000" w:type="dxa"/>
+            <w:tcW w:w="1400" w:type="dxa"/>
             <w:vAlign w:val="center"/>
           </w:tcPr>
           <w:p>
@@ -9389,7 +9203,7 @@
       <w:tr>
         <w:tc>
           <w:tcPr>
-            <w:tcW w:w="900" w:type="dxa"/>
+            <w:tcW w:w="1000" w:type="dxa"/>
             <w:vAlign w:val="center"/>
           </w:tcPr>
           <w:p>
@@ -9411,7 +9225,7 @@
         </w:tc>
         <w:tc>
           <w:tcPr>
-            <w:tcW w:w="1200" w:type="dxa"/>
+            <w:tcW w:w="1500" w:type="dxa"/>
             <w:vAlign w:val="center"/>
           </w:tcPr>
           <w:p>
@@ -9449,13 +9263,13 @@
                 <w:color w:val="000000"/>
                 <w:sz w:val="18"/>
               </w:rPr>
-              <w:t xml:space="preserve">25</w:t>
+              <w:t xml:space="preserve">30</w:t>
             </w:r>
           </w:p>
         </w:tc>
         <w:tc>
           <w:tcPr>
-            <w:tcW w:w="800" w:type="dxa"/>
+            <w:tcW w:w="1500" w:type="dxa"/>
             <w:vAlign w:val="center"/>
           </w:tcPr>
           <w:p>
@@ -9477,29 +9291,7 @@
         </w:tc>
         <w:tc>
           <w:tcPr>
-            <w:tcW w:w="1100" w:type="dxa"/>
-            <w:vAlign w:val="center"/>
-          </w:tcPr>
-          <w:p>
-            <w:pPr>
-              <w:spacing w:before="20" w:after="20" w:line="240" w:lineRule="auto"/>
-              <w:jc w:val="left"/>
-            </w:pPr>
-            <w:r>
-              <w:rPr>
-                <w:rFonts w:ascii="Times New Roman" w:hAnsi="Times New Roman" w:eastAsia="Times New Roman" w:cs="Times New Roman"/>
-                <w:b w:val="0"/>
-                <w:i w:val="0"/>
-                <w:color w:val="000000"/>
-                <w:sz w:val="18"/>
-              </w:rPr>
-              <w:t xml:space="preserve">30</w:t>
-            </w:r>
-          </w:p>
-        </w:tc>
-        <w:tc>
-          <w:tcPr>
-            <w:tcW w:w="1000" w:type="dxa"/>
+            <w:tcW w:w="1400" w:type="dxa"/>
             <w:vAlign w:val="center"/>
           </w:tcPr>
           <w:p>
@@ -9567,7 +9359,7 @@
       <w:tr>
         <w:tc>
           <w:tcPr>
-            <w:tcW w:w="900" w:type="dxa"/>
+            <w:tcW w:w="1000" w:type="dxa"/>
             <w:vAlign w:val="center"/>
           </w:tcPr>
           <w:p>
@@ -9589,7 +9381,7 @@
         </w:tc>
         <w:tc>
           <w:tcPr>
-            <w:tcW w:w="1200" w:type="dxa"/>
+            <w:tcW w:w="1500" w:type="dxa"/>
             <w:vAlign w:val="center"/>
           </w:tcPr>
           <w:p>
@@ -9627,13 +9419,13 @@
                 <w:color w:val="000000"/>
                 <w:sz w:val="18"/>
               </w:rPr>
-              <w:t xml:space="preserve">99</w:t>
+              <w:t xml:space="preserve">107</w:t>
             </w:r>
           </w:p>
         </w:tc>
         <w:tc>
           <w:tcPr>
-            <w:tcW w:w="800" w:type="dxa"/>
+            <w:tcW w:w="1500" w:type="dxa"/>
             <w:vAlign w:val="center"/>
           </w:tcPr>
           <w:p>
@@ -9655,29 +9447,7 @@
         </w:tc>
         <w:tc>
           <w:tcPr>
-            <w:tcW w:w="1100" w:type="dxa"/>
-            <w:vAlign w:val="center"/>
-          </w:tcPr>
-          <w:p>
-            <w:pPr>
-              <w:spacing w:before="20" w:after="20" w:line="240" w:lineRule="auto"/>
-              <w:jc w:val="left"/>
-            </w:pPr>
-            <w:r>
-              <w:rPr>
-                <w:rFonts w:ascii="Times New Roman" w:hAnsi="Times New Roman" w:eastAsia="Times New Roman" w:cs="Times New Roman"/>
-                <w:b w:val="0"/>
-                <w:i w:val="0"/>
-                <w:color w:val="000000"/>
-                <w:sz w:val="18"/>
-              </w:rPr>
-              <w:t xml:space="preserve">107</w:t>
-            </w:r>
-          </w:p>
-        </w:tc>
-        <w:tc>
-          <w:tcPr>
-            <w:tcW w:w="1000" w:type="dxa"/>
+            <w:tcW w:w="1400" w:type="dxa"/>
             <w:vAlign w:val="center"/>
           </w:tcPr>
           <w:p>
@@ -9745,7 +9515,7 @@
       <w:tr>
         <w:tc>
           <w:tcPr>
-            <w:tcW w:w="900" w:type="dxa"/>
+            <w:tcW w:w="1000" w:type="dxa"/>
             <w:vAlign w:val="center"/>
           </w:tcPr>
           <w:p>
@@ -9767,7 +9537,7 @@
         </w:tc>
         <w:tc>
           <w:tcPr>
-            <w:tcW w:w="1200" w:type="dxa"/>
+            <w:tcW w:w="1500" w:type="dxa"/>
             <w:vAlign w:val="center"/>
           </w:tcPr>
           <w:p>
@@ -9805,35 +9575,13 @@
                 <w:color w:val="000000"/>
                 <w:sz w:val="18"/>
               </w:rPr>
-              <w:t xml:space="preserve">21</w:t>
-            </w:r>
-          </w:p>
-        </w:tc>
-        <w:tc>
-          <w:tcPr>
-            <w:tcW w:w="800" w:type="dxa"/>
-            <w:vAlign w:val="center"/>
-          </w:tcPr>
-          <w:p>
-            <w:pPr>
-              <w:spacing w:before="20" w:after="20" w:line="240" w:lineRule="auto"/>
-              <w:jc w:val="left"/>
-            </w:pPr>
-            <w:r>
-              <w:rPr>
-                <w:rFonts w:ascii="Times New Roman" w:hAnsi="Times New Roman" w:eastAsia="Times New Roman" w:cs="Times New Roman"/>
-                <w:b w:val="0"/>
-                <w:i w:val="0"/>
-                <w:color w:val="000000"/>
-                <w:sz w:val="18"/>
-              </w:rPr>
               <w:t xml:space="preserve">33</w:t>
             </w:r>
           </w:p>
         </w:tc>
         <w:tc>
           <w:tcPr>
-            <w:tcW w:w="1100" w:type="dxa"/>
+            <w:tcW w:w="1500" w:type="dxa"/>
             <w:vAlign w:val="center"/>
           </w:tcPr>
           <w:p>
@@ -9855,7 +9603,7 @@
         </w:tc>
         <w:tc>
           <w:tcPr>
-            <w:tcW w:w="1000" w:type="dxa"/>
+            <w:tcW w:w="1400" w:type="dxa"/>
             <w:vAlign w:val="center"/>
           </w:tcPr>
           <w:p>
@@ -9923,7 +9671,7 @@
       <w:tr>
         <w:tc>
           <w:tcPr>
-            <w:tcW w:w="900" w:type="dxa"/>
+            <w:tcW w:w="1000" w:type="dxa"/>
             <w:vAlign w:val="center"/>
           </w:tcPr>
           <w:p>
@@ -9945,7 +9693,7 @@
         </w:tc>
         <w:tc>
           <w:tcPr>
-            <w:tcW w:w="1200" w:type="dxa"/>
+            <w:tcW w:w="1500" w:type="dxa"/>
             <w:vAlign w:val="center"/>
           </w:tcPr>
           <w:p>
@@ -9983,13 +9731,13 @@
                 <w:color w:val="000000"/>
                 <w:sz w:val="18"/>
               </w:rPr>
-              <w:t xml:space="preserve">68</w:t>
+              <w:t xml:space="preserve">79</w:t>
             </w:r>
           </w:p>
         </w:tc>
         <w:tc>
           <w:tcPr>
-            <w:tcW w:w="800" w:type="dxa"/>
+            <w:tcW w:w="1500" w:type="dxa"/>
             <w:vAlign w:val="center"/>
           </w:tcPr>
           <w:p>
@@ -10011,29 +9759,7 @@
         </w:tc>
         <w:tc>
           <w:tcPr>
-            <w:tcW w:w="1100" w:type="dxa"/>
-            <w:vAlign w:val="center"/>
-          </w:tcPr>
-          <w:p>
-            <w:pPr>
-              <w:spacing w:before="20" w:after="20" w:line="240" w:lineRule="auto"/>
-              <w:jc w:val="left"/>
-            </w:pPr>
-            <w:r>
-              <w:rPr>
-                <w:rFonts w:ascii="Times New Roman" w:hAnsi="Times New Roman" w:eastAsia="Times New Roman" w:cs="Times New Roman"/>
-                <w:b w:val="0"/>
-                <w:i w:val="0"/>
-                <w:color w:val="000000"/>
-                <w:sz w:val="18"/>
-              </w:rPr>
-              <w:t xml:space="preserve">79</w:t>
-            </w:r>
-          </w:p>
-        </w:tc>
-        <w:tc>
-          <w:tcPr>
-            <w:tcW w:w="1000" w:type="dxa"/>
+            <w:tcW w:w="1400" w:type="dxa"/>
             <w:vAlign w:val="center"/>
           </w:tcPr>
           <w:p>
@@ -10101,7 +9827,7 @@
       <w:tr>
         <w:tc>
           <w:tcPr>
-            <w:tcW w:w="900" w:type="dxa"/>
+            <w:tcW w:w="1000" w:type="dxa"/>
             <w:vAlign w:val="center"/>
           </w:tcPr>
           <w:p>
@@ -10123,7 +9849,7 @@
         </w:tc>
         <w:tc>
           <w:tcPr>
-            <w:tcW w:w="1200" w:type="dxa"/>
+            <w:tcW w:w="1500" w:type="dxa"/>
             <w:vAlign w:val="center"/>
           </w:tcPr>
           <w:p>
@@ -10167,29 +9893,7 @@
         </w:tc>
         <w:tc>
           <w:tcPr>
-            <w:tcW w:w="800" w:type="dxa"/>
-            <w:vAlign w:val="center"/>
-          </w:tcPr>
-          <w:p>
-            <w:pPr>
-              <w:spacing w:before="20" w:after="20" w:line="240" w:lineRule="auto"/>
-              <w:jc w:val="left"/>
-            </w:pPr>
-            <w:r>
-              <w:rPr>
-                <w:rFonts w:ascii="Times New Roman" w:hAnsi="Times New Roman" w:eastAsia="Times New Roman" w:cs="Times New Roman"/>
-                <w:b w:val="0"/>
-                <w:i w:val="0"/>
-                <w:color w:val="000000"/>
-                <w:sz w:val="18"/>
-              </w:rPr>
-              <w:t xml:space="preserve">174</w:t>
-            </w:r>
-          </w:p>
-        </w:tc>
-        <w:tc>
-          <w:tcPr>
-            <w:tcW w:w="1100" w:type="dxa"/>
+            <w:tcW w:w="1500" w:type="dxa"/>
             <w:vAlign w:val="center"/>
           </w:tcPr>
           <w:p>
@@ -10211,7 +9915,7 @@
         </w:tc>
         <w:tc>
           <w:tcPr>
-            <w:tcW w:w="1000" w:type="dxa"/>
+            <w:tcW w:w="1400" w:type="dxa"/>
             <w:vAlign w:val="center"/>
           </w:tcPr>
           <w:p>
@@ -10279,7 +9983,7 @@
       <w:tr>
         <w:tc>
           <w:tcPr>
-            <w:tcW w:w="900" w:type="dxa"/>
+            <w:tcW w:w="1000" w:type="dxa"/>
             <w:vAlign w:val="center"/>
           </w:tcPr>
           <w:p>
@@ -10301,7 +10005,7 @@
         </w:tc>
         <w:tc>
           <w:tcPr>
-            <w:tcW w:w="1200" w:type="dxa"/>
+            <w:tcW w:w="1500" w:type="dxa"/>
             <w:vAlign w:val="center"/>
           </w:tcPr>
           <w:p>
@@ -10339,35 +10043,13 @@
                 <w:color w:val="000000"/>
                 <w:sz w:val="18"/>
               </w:rPr>
-              <w:t xml:space="preserve">69</w:t>
-            </w:r>
-          </w:p>
-        </w:tc>
-        <w:tc>
-          <w:tcPr>
-            <w:tcW w:w="800" w:type="dxa"/>
-            <w:vAlign w:val="center"/>
-          </w:tcPr>
-          <w:p>
-            <w:pPr>
-              <w:spacing w:before="20" w:after="20" w:line="240" w:lineRule="auto"/>
-              <w:jc w:val="left"/>
-            </w:pPr>
-            <w:r>
-              <w:rPr>
-                <w:rFonts w:ascii="Times New Roman" w:hAnsi="Times New Roman" w:eastAsia="Times New Roman" w:cs="Times New Roman"/>
-                <w:b w:val="0"/>
-                <w:i w:val="0"/>
-                <w:color w:val="000000"/>
-                <w:sz w:val="18"/>
-              </w:rPr>
               <w:t xml:space="preserve">85</w:t>
             </w:r>
           </w:p>
         </w:tc>
         <w:tc>
           <w:tcPr>
-            <w:tcW w:w="1100" w:type="dxa"/>
+            <w:tcW w:w="1500" w:type="dxa"/>
             <w:vAlign w:val="center"/>
           </w:tcPr>
           <w:p>
@@ -10389,7 +10071,7 @@
         </w:tc>
         <w:tc>
           <w:tcPr>
-            <w:tcW w:w="1000" w:type="dxa"/>
+            <w:tcW w:w="1400" w:type="dxa"/>
             <w:vAlign w:val="center"/>
           </w:tcPr>
           <w:p>
@@ -10457,7 +10139,7 @@
       <w:tr>
         <w:tc>
           <w:tcPr>
-            <w:tcW w:w="900" w:type="dxa"/>
+            <w:tcW w:w="1000" w:type="dxa"/>
             <w:vAlign w:val="center"/>
           </w:tcPr>
           <w:p>
@@ -10479,7 +10161,7 @@
         </w:tc>
         <w:tc>
           <w:tcPr>
-            <w:tcW w:w="1200" w:type="dxa"/>
+            <w:tcW w:w="1500" w:type="dxa"/>
             <w:vAlign w:val="center"/>
           </w:tcPr>
           <w:p>
@@ -10517,13 +10199,13 @@
                 <w:color w:val="000000"/>
                 <w:sz w:val="18"/>
               </w:rPr>
-              <w:t xml:space="preserve">127</w:t>
+              <w:t xml:space="preserve">134</w:t>
             </w:r>
           </w:p>
         </w:tc>
         <w:tc>
           <w:tcPr>
-            <w:tcW w:w="800" w:type="dxa"/>
+            <w:tcW w:w="1500" w:type="dxa"/>
             <w:vAlign w:val="center"/>
           </w:tcPr>
           <w:p>
@@ -10545,29 +10227,7 @@
         </w:tc>
         <w:tc>
           <w:tcPr>
-            <w:tcW w:w="1100" w:type="dxa"/>
-            <w:vAlign w:val="center"/>
-          </w:tcPr>
-          <w:p>
-            <w:pPr>
-              <w:spacing w:before="20" w:after="20" w:line="240" w:lineRule="auto"/>
-              <w:jc w:val="left"/>
-            </w:pPr>
-            <w:r>
-              <w:rPr>
-                <w:rFonts w:ascii="Times New Roman" w:hAnsi="Times New Roman" w:eastAsia="Times New Roman" w:cs="Times New Roman"/>
-                <w:b w:val="0"/>
-                <w:i w:val="0"/>
-                <w:color w:val="000000"/>
-                <w:sz w:val="18"/>
-              </w:rPr>
-              <w:t xml:space="preserve">134</w:t>
-            </w:r>
-          </w:p>
-        </w:tc>
-        <w:tc>
-          <w:tcPr>
-            <w:tcW w:w="1000" w:type="dxa"/>
+            <w:tcW w:w="1400" w:type="dxa"/>
             <w:vAlign w:val="center"/>
           </w:tcPr>
           <w:p>
@@ -10635,7 +10295,7 @@
       <w:tr>
         <w:tc>
           <w:tcPr>
-            <w:tcW w:w="900" w:type="dxa"/>
+            <w:tcW w:w="1000" w:type="dxa"/>
             <w:vAlign w:val="center"/>
           </w:tcPr>
           <w:p>
@@ -10657,7 +10317,7 @@
         </w:tc>
         <w:tc>
           <w:tcPr>
-            <w:tcW w:w="1200" w:type="dxa"/>
+            <w:tcW w:w="1500" w:type="dxa"/>
             <w:vAlign w:val="center"/>
           </w:tcPr>
           <w:p>
@@ -10695,35 +10355,13 @@
                 <w:color w:val="000000"/>
                 <w:sz w:val="18"/>
               </w:rPr>
-              <w:t xml:space="preserve">66</w:t>
-            </w:r>
-          </w:p>
-        </w:tc>
-        <w:tc>
-          <w:tcPr>
-            <w:tcW w:w="800" w:type="dxa"/>
-            <w:vAlign w:val="center"/>
-          </w:tcPr>
-          <w:p>
-            <w:pPr>
-              <w:spacing w:before="20" w:after="20" w:line="240" w:lineRule="auto"/>
-              <w:jc w:val="left"/>
-            </w:pPr>
-            <w:r>
-              <w:rPr>
-                <w:rFonts w:ascii="Times New Roman" w:hAnsi="Times New Roman" w:eastAsia="Times New Roman" w:cs="Times New Roman"/>
-                <w:b w:val="0"/>
-                <w:i w:val="0"/>
-                <w:color w:val="000000"/>
-                <w:sz w:val="18"/>
-              </w:rPr>
               <w:t xml:space="preserve">70</w:t>
             </w:r>
           </w:p>
         </w:tc>
         <w:tc>
           <w:tcPr>
-            <w:tcW w:w="1100" w:type="dxa"/>
+            <w:tcW w:w="1500" w:type="dxa"/>
             <w:vAlign w:val="center"/>
           </w:tcPr>
           <w:p>
@@ -10745,7 +10383,7 @@
         </w:tc>
         <w:tc>
           <w:tcPr>
-            <w:tcW w:w="1000" w:type="dxa"/>
+            <w:tcW w:w="1400" w:type="dxa"/>
             <w:vAlign w:val="center"/>
           </w:tcPr>
           <w:p>
@@ -10813,7 +10451,7 @@
       <w:tr>
         <w:tc>
           <w:tcPr>
-            <w:tcW w:w="900" w:type="dxa"/>
+            <w:tcW w:w="1000" w:type="dxa"/>
             <w:vAlign w:val="center"/>
           </w:tcPr>
           <w:p>
@@ -10835,7 +10473,7 @@
         </w:tc>
         <w:tc>
           <w:tcPr>
-            <w:tcW w:w="1200" w:type="dxa"/>
+            <w:tcW w:w="1500" w:type="dxa"/>
             <w:vAlign w:val="center"/>
           </w:tcPr>
           <w:p>
@@ -10879,29 +10517,7 @@
         </w:tc>
         <w:tc>
           <w:tcPr>
-            <w:tcW w:w="800" w:type="dxa"/>
-            <w:vAlign w:val="center"/>
-          </w:tcPr>
-          <w:p>
-            <w:pPr>
-              <w:spacing w:before="20" w:after="20" w:line="240" w:lineRule="auto"/>
-              <w:jc w:val="left"/>
-            </w:pPr>
-            <w:r>
-              <w:rPr>
-                <w:rFonts w:ascii="Times New Roman" w:hAnsi="Times New Roman" w:eastAsia="Times New Roman" w:cs="Times New Roman"/>
-                <w:b w:val="0"/>
-                <w:i w:val="0"/>
-                <w:color w:val="000000"/>
-                <w:sz w:val="18"/>
-              </w:rPr>
-              <w:t xml:space="preserve">98</w:t>
-            </w:r>
-          </w:p>
-        </w:tc>
-        <w:tc>
-          <w:tcPr>
-            <w:tcW w:w="1100" w:type="dxa"/>
+            <w:tcW w:w="1500" w:type="dxa"/>
             <w:vAlign w:val="center"/>
           </w:tcPr>
           <w:p>
@@ -10923,7 +10539,7 @@
         </w:tc>
         <w:tc>
           <w:tcPr>
-            <w:tcW w:w="1000" w:type="dxa"/>
+            <w:tcW w:w="1400" w:type="dxa"/>
             <w:vAlign w:val="center"/>
           </w:tcPr>
           <w:p>
@@ -11008,7 +10624,7 @@
           <w:color w:val="000000"/>
           <w:sz w:val="20"/>
         </w:rPr>
-        <w:t xml:space="preserve">Табл. 5. Каждая смена правил в каждом прогоне. «Свидетельство» — первое различающее нажатие после смены; «нет» в строгом R1 означает, что верного предсказания на изменённом поле с полным обязательством не было.</w:t>
+        <w:t xml:space="preserve">Табл. 5. Каждая смена правил в каждом прогоне. Задержка — от первого различающего нажатия после смены до строгого R1; «нет» означает, что верного предсказания на изменённом поле с полным обязательством не было.</w:t>
       </w:r>
     </w:p>
     <w:p>
@@ -11142,7 +10758,7 @@
           <w:color w:val="000000"/>
           <w:sz w:val="24"/>
         </w:rPr>
-        <w:t xml:space="preserve">A (ранняя смена). Первая смена, пришедшаяся на комнату 4 после трёх комнат опыта, стоила одну гибель и 5 нажатий задержки против двух гибелей и 25 у основного прогона; комнаты 5–9 пройдены без единого возврата. Зато вторая смена стоила две гибели: агент пошёл длинным маршрутом к спицам в комнате 10 и в комнате 11 снова нажал на спицы через ход после того, как написал, что они возвращают на старт. Ожидание подтверждено, и укоренённость проявилась на той смене, которой предшествовало больше опыта (шесть комнат при сменённых правилах).</w:t>
+        <w:t xml:space="preserve">A (ранняя смена). Первая смена, пришедшаяся на комнату 4 после трёх комнат опыта, стоила одну гибель и 5 нажатий задержки против двух гибелей и 25 у основного прогона; комнаты 5–9 пройдены без единого возврата. Зато вторая смена стоила две гибели: агент пошёл длинным маршрутом к спицам в комнате 10 и в комнате 11 снова нажал на спицы через ход после того, как написал, что они возвращают на старт. Ожидание подтверждено в этом прогоне: более дорогой оказалась та смена, которой предшествовало больше опыта (шесть комнат при сменённых правилах). Вариация меняет и комнату, в которой происходит смена, поэтому вклад опыта здесь не изолирован.</w:t>
       </w:r>
     </w:p>
     <w:p>
@@ -11250,7 +10866,7 @@
           <w:color w:val="000000"/>
           <w:sz w:val="24"/>
         </w:rPr>
-        <w:t xml:space="preserve"> оставлены пустыми, тогда как на кольца он продолжал ставить «сменится комната» и дважды погиб (комнаты 7 и 9, в том числе на прямом пути в комнате 9). Действие пересмотрено, предсказание — нет; строгий R1 для первой смены не достигнут. Вторая смена восстановлена без гибелей.</w:t>
+        <w:t xml:space="preserve"> оставлены пустыми, тогда как на кольца он продолжал ставить «сменится комната» и дважды погиб (комнаты 7 и 9, в том числе на прямом пути в комнате 9). Полнота ответов на изменённых полях в этом прогоне 33% против 75% в основном. Действие пересмотрено, предсказание — нет; строгий R1 для первой смены не достигнут. Вторая смена восстановлена без гибелей.</w:t>
       </w:r>
     </w:p>
     <w:p>
@@ -11433,7 +11049,7 @@
           <w:color w:val="000000"/>
           <w:sz w:val="24"/>
         </w:rPr>
-        <w:t xml:space="preserve">RQ3. Да, с задержкой, которая зависит от того, сколько опыта стоит за правилом: 5 нажатий и одна гибель, когда правило держалось одну комнату (A), 25 и две гибели, когда шесть (основной прогон), 37 и две без </w:t>
+        <w:t xml:space="preserve">RQ3. Да, с задержкой. В наблюдавшихся прогонах она была тем больше, чем дольше держалось правило: 5 нажатий и одна гибель после одной комнаты с правилом (A), 25 и две гибели после шести (основной прогон), 37 и две без </w:t>
       </w:r>
       <w:r>
         <w:rPr>
@@ -11453,7 +11069,7 @@
           <w:color w:val="000000"/>
           <w:sz w:val="24"/>
         </w:rPr>
-        <w:t xml:space="preserve"> (C). В D предсказания после первой смены не пересмотрены вовсе при пересмотренном действии.</w:t>
+        <w:t xml:space="preserve"> (C); при одном прогоне на условие это совпадение, а не установленная зависимость. В D предсказания после первой смены не пересмотрены вовсе при пересмотренном действии.</w:t>
       </w:r>
     </w:p>
     <w:p>
@@ -11469,7 +11085,7 @@
           <w:color w:val="000000"/>
           <w:sz w:val="24"/>
         </w:rPr>
-        <w:t xml:space="preserve">RQ4. Пересмотр локален во всех прогонах: точность на незатронутых полях после смены отличается от точности до неё на +1, -1, +2 и +2 п.п. в основном прогоне, A, C и D (в B — 0), то есть держится в пределах двух пунктов в обе стороны при пороге 5. Вторая смена дешевле первой в основном прогоне, C и D, но не в A (где первая была дешёвой) и не в B, где три смены привели к ложной механической модели вместо идеи о смене. По восстановлению гипотеза выполнена для всех смен в трёх прогонах из пяти (в B и D — для одной из смен), по сохранению — во всех пяти.</w:t>
+        <w:t xml:space="preserve">RQ4. Пересмотр локален во всех прогонах: точность на незатронутых полях после смены отличается от точности до неё на +1,3, -1,1, +2,1 и +1,8 п.п. в основном прогоне, A, C и D (в B — 0), то есть держится в пределах двух пунктов в обе стороны при пороге 5. Вторая смена оказалась дешевле первой в основном прогоне, C и D, но не в A (где дешёвой была первая) и не в B, где три смены сопровождались ложной механической моделью вместо идеи о смене. По восстановлению гипотеза выполнена для всех смен в трёх прогонах из пяти (в B и D — для одной из смен), по сохранению — во всех пяти.</w:t>
       </w:r>
     </w:p>
     <w:p>
@@ -11538,7 +11154,7 @@
           <w:color w:val="000000"/>
           <w:sz w:val="24"/>
         </w:rPr>
-        <w:t xml:space="preserve">Второе условие — чтобы у агента не было другого объяснения под рукой. В вариации B и после первой смены в C он такое объяснение нашёл: второй вид пола, ничего не значащий по замыслу, стал «переключателями». Пока эта гипотеза объясняла увиденное, смена правил как гипотеза не рассматривалась. Отсюда третье наблюдение: пересмотр становится общим правилом после второго свидетельства в другой комнате (основной прогон, C), а после первого остаётся фактом об одной комнате. Что из этого свойство модели, а что — устройства стенда, единичные прогоны не разделяют.</w:t>
+        <w:t xml:space="preserve">Второе условие — чтобы у агента не было другого объяснения под рукой. В вариации B и после первой смены в C он такое объяснение нашёл: второй вид пола, ничего не значащий по замыслу, стал «переключателями». Пока эта гипотеза объясняла увиденное, смена правил как гипотеза не рассматривалась. Отсюда третье наблюдение: пересмотр становится общим правилом после второго свидетельства в другой комнате (основной прогон, C), а после первого остаётся фактом об одной комнате. Что из этого свойство модели, а что — устройства стенда, единичные прогоны не разделяют; эхо прошлого предсказания как отдельный фактор в работе не абляировалось.</w:t>
       </w:r>
     </w:p>
     <w:p>
@@ -11604,7 +11220,7 @@
           <w:color w:val="000000"/>
           <w:sz w:val="24"/>
         </w:rPr>
-        <w:t xml:space="preserve">Для агентов на языковых моделях в целом работа показывает, что пересмотр правила измерим отдельно от успеха, если агент обязан предсказывать до действия и если среда сообщает результат без причины. Два наблюдения переносимы за пределы сеточного мира как гипотезы: пересмотр начинается как локальный факт и становится правилом только после повторения, а вторая смена того же рода обходится дешевле первой. Прикладной вывод для инженерии агентов: поле вида </w:t>
+        <w:t xml:space="preserve">Для агентов на языковых моделях в целом работа показывает, что пересмотр правила измерим отдельно от успеха, если агент обязан предсказывать до действия и если среда сообщает результат без причины. Два наблюдения переносимы за пределы сеточного мира как гипотезы: пересмотр начинается как локальный факт и становится правилом только после повторения, а вторая смена того же рода обходится дешевле первой. Прикладной вывод для инженерии агентов, по 4.2: дешевле всего обходится обязательство до действия и показ агенту его же предсказания рядом с результатом; промежуточное состояние (</w:t>
       </w:r>
       <w:r>
         <w:rPr>
@@ -11624,7 +11240,7 @@
           <w:color w:val="000000"/>
           <w:sz w:val="24"/>
         </w:rPr>
-        <w:t xml:space="preserve"> (промежуточное состояние, которое человек увидел бы, а сухой отчёт «до/после» скрывает) стоит дешевле всех остальных механизмов и, судя по 4.2, несёт больше всего. Проверка этого на реальных программных средах остаётся гипотезой.</w:t>
+        <w:t xml:space="preserve">) по абляции оказалось менее важным, чем предполагалось. Проверка этого на реальных программных средах остаётся гипотезой.</w:t>
       </w:r>
     </w:p>
     <w:p>
@@ -11657,7 +11273,7 @@
           <w:color w:val="000000"/>
           <w:sz w:val="24"/>
         </w:rPr>
-        <w:t xml:space="preserve">Один прогон на условие: разброс между сеансами одной модели неизвестен, и различия между вариациями (например, одна гибель против двух) не отличимы от случайности без повторов. Один субъект: codex поверх gpt-5.6-luna несёт около 12 тысяч токенов собственной оболочки в каждом вызове и не сопоставим с моделью, вызванной через API напрямую. Сеточная абстракция: шесть типов клеток, четыре действия, одно изменяемое правило. Все правила и наблюдения на английском. Внутренние рассуждения модели стенд не записывает, только её ответы. Бюджет 100 нажатий выше протокольных 25, и вариация D показывает, что бюджет влияет и на прохождение (комната 6), и на готовность обязываться в предсказаниях.</w:t>
+        <w:t xml:space="preserve">Один прогон на условие: разброс между сеансами одной модели неизвестен, и различия между вариациями (например, одна гибель против двух) не отличимы от случайности без повторов; все причинные формулировки в работе следует читать как наблюдения в единичных прогонах. Вариация A меняет не только объём опыта до смены, но и комнату, в которой смена происходит, поэтому «укоренённость» в ней не изолирована. Два поля схемы ответа (возврат на старт, смена комнаты) заранее выделяют исходы, которыми различаются поверхности, — это подсказка о факторизации мира, хотя и не о правиле. Один субъект: codex поверх gpt-5.6-luna несёт около 12 тысяч токенов собственной оболочки в каждом вызове и не сопоставим с моделью, вызванной через API напрямую. Сеточная абстракция: шесть типов клеток, четыре действия, одно изменяемое правило. Все правила и наблюдения на английском. Внутренние рассуждения модели стенд не записывает, только её ответы. Бюджет 100 нажатий выше протокольных 25, и вариация D показывает, что бюджет влияет и на прохождение (комната 6), и на готовность обязываться в предсказаниях.</w:t>
       </w:r>
     </w:p>
     <w:p>
@@ -11723,7 +11339,7 @@
           <w:color w:val="000000"/>
           <w:sz w:val="24"/>
         </w:rPr>
-        <w:t xml:space="preserve">На вопрос, способен ли агент на языковой модели открыть правила неизвестной среды, заметить их скрытую смену и пересмотреть именно изменившееся, работа отвечает «да» для одного субъекта и одного учебного плана, с оговоркой о единичных прогонах. Построен стенд из одиннадцати комнат с двумя скрытыми сменами правил, агентом без инструкций о мире и обязательными предсказаниями до каждого нажатия; среда автоматически проверяется на утечки, а любой прогон воспроизводится по журналу. Основной прогон: 11 из 11 комнат, 116 нажатий, 4 возврата на старт, 95% верных проверяемых полей, восстановление после обеих смен по строгому критерию, вторая смена дешевле первой, точность на незатронутых полях без потерь. Найдены и описаны три устойчивые ошибки: локальность первого пересмотра, непредсказуемость отражателя и случайный успех устаревшего плана. Значение работы — в инструменте, который делает знание агента и его пересмотр измеримыми, и в четырёх вариациях, показывающих, от каких параметров этот пересмотр зависит. Четыре вариации уточнили, от чего пересмотр зависит: от опыта, стоящего за правилом (одна комната — одна гибель, шесть комнат — две), от наличия готового альтернативного объяснения (три смены подряд родили модель «переключателей», которую ни одна гибель не опровергает) и от бюджета (при 25 нажатиях агент действует по новому правилу, не обязываясь предсказаниями); клетка </w:t>
+        <w:t xml:space="preserve">На вопрос, способен ли агент на языковой модели открыть правила неизвестной среды, заметить их скрытую смену и пересмотреть именно изменившееся, работа отвечает «да» для одного субъекта и одного учебного плана, с оговоркой о единичных прогонах. Построен стенд из одиннадцати комнат с двумя скрытыми сменами правил, агентом без инструкций о мире и обязательными предсказаниями до каждого нажатия; среда автоматически проверяется на утечки, а любой прогон воспроизводится по журналу. Основной прогон: 11 из 11 комнат, 116 нажатий, 4 возврата на старт, 95% верных проверяемых полей, восстановление после обеих смен по строгому критерию, вторая смена дешевле первой, точность на незатронутых полях без потерь. Выявлены четыре характерных типа ошибок в проведённых прогонах: локальность первого пересмотра, ложная механика вместо смены, расхождение действия и предсказания, непредсказуемость отражателя. Значение работы — в инструменте, который делает поведенческий успех, обнаружение смены, пересмотр затронутого правила и сохранение незатронутого раздельно измеримыми; четыре вариации показывают, с какими параметрами эти величины менялись в единичных прогонах, и задают, что проверять повторами. В четырёх вариациях цена пересмотра менялась вместе с опытом, стоявшим за правилом (одна комната — одна гибель, шесть комнат — две), с наличием готового альтернативного объяснения (три смены подряд сопровождались моделью «переключателей», которую ни одна гибель не опровергает) и с бюджетом (при 25 нажатиях агент действовал по новому правилу, не обязываясь предсказаниями); клетка </w:t>
       </w:r>
       <w:r>
         <w:rPr>
@@ -11743,7 +11359,7 @@
           <w:color w:val="000000"/>
           <w:sz w:val="24"/>
         </w:rPr>
-        <w:t xml:space="preserve"> оказалась не тем, на чём держится атрибуция.</w:t>
+        <w:t xml:space="preserve"> оказалась не тем, на чём держится атрибуция. Это наблюдения в единичных прогонах, и повторы — первое, что должно последовать.</w:t>
       </w:r>
     </w:p>
     <w:p>
@@ -11776,7 +11392,7 @@
           <w:color w:val="000000"/>
           <w:sz w:val="24"/>
         </w:rPr>
-        <w:t xml:space="preserve">1. Ha D., Schmidhuber J. World Models // arXiv:1803.10122. 2018. (NeurIPS 2018: Recurrent World Models Facilitate Policy Evolution.)</w:t>
+        <w:t xml:space="preserve">1. Ha D., Schmidhuber J. Recurrent World Models Facilitate Policy Evolution // Advances in Neural Information Processing Systems 31 (NeurIPS 2018). 2018.</w:t>
       </w:r>
     </w:p>
     <w:p>
@@ -11840,7 +11456,7 @@
           <w:color w:val="000000"/>
           <w:sz w:val="24"/>
         </w:rPr>
-        <w:t xml:space="preserve">5. ARC Prize Foundation. ARC-AGI-3: Interactive Reasoning Benchmark. 2026. URL: https://arcprize.org/arc-agi/3 (дата обращения: 20.09.2026).</w:t>
+        <w:t xml:space="preserve">5. ARC Prize Foundation. ARC-AGI-3: Interactive Reasoning Benchmark (описание бенчмарка и технический отчёт). 2026. URL: https://arcprize.org/arc-agi/3 (дата обращения: 20.09.2026).</w:t>
       </w:r>
     </w:p>
     <w:p>
@@ -12187,7 +11803,7 @@
                 <w:color w:val="000000"/>
                 <w:sz w:val="18"/>
               </w:rPr>
-              <w:t xml:space="preserve">Постановка: измерять приобретение и пересмотр модели мира, а не успех. Первая версия движка (кнопки относительно направления, отражатель поворачивал на месте). Поиск в ширину как проверка комнат: найдена комната, которую можно пройти, не выучив её механику; введено правило «комната неразрешима без объявленной поверхности».</w:t>
+              <w:t xml:space="preserve">Постановка (E0): измерять приобретение и пересмотр модели мира, а не успех прохождения; главный риск — среда, которая сама подсказывает агенту причину. Первая версия движка (E1): кнопки относительно направления взгляда, отражатель поворачивал на месте.</w:t>
             </w:r>
           </w:p>
         </w:tc>
@@ -12233,7 +11849,53 @@
                 <w:color w:val="000000"/>
                 <w:sz w:val="18"/>
               </w:rPr>
-              <w:t xml:space="preserve">Пробные прогоны. Обнаружено, что агент не видит своего прошлого предсказания и не может зафиксировать противоречие; добавлен возврат предсказания в наблюдение. Три ошибки инструмента, скрывавшие информацию, которую видел бы человек: исправлены, записаны.</w:t>
+              <w:t xml:space="preserve">Проверка комнат поиском в ширину (E2) нашла комнату, проходимую без её механики; введено правило «комната неразрешима без объявленной поверхности», проверяется автоматически.</w:t>
+            </w:r>
+          </w:p>
+        </w:tc>
+      </w:tr>
+      <w:tr>
+        <w:tc>
+          <w:tcPr>
+            <w:tcW w:w="1400" w:type="dxa"/>
+            <w:vAlign w:val="center"/>
+          </w:tcPr>
+          <w:p>
+            <w:pPr>
+              <w:spacing w:before="20" w:after="20" w:line="240" w:lineRule="auto"/>
+              <w:jc w:val="left"/>
+            </w:pPr>
+            <w:r>
+              <w:rPr>
+                <w:rFonts w:ascii="Times New Roman" w:hAnsi="Times New Roman" w:eastAsia="Times New Roman" w:cs="Times New Roman"/>
+                <w:b w:val="0"/>
+                <w:i w:val="0"/>
+                <w:color w:val="000000"/>
+                <w:sz w:val="18"/>
+              </w:rPr>
+              <w:t xml:space="preserve">18.09.2026</w:t>
+            </w:r>
+          </w:p>
+        </w:tc>
+        <w:tc>
+          <w:tcPr>
+            <w:tcW w:w="8000" w:type="dxa"/>
+            <w:vAlign w:val="center"/>
+          </w:tcPr>
+          <w:p>
+            <w:pPr>
+              <w:spacing w:before="20" w:after="20" w:line="240" w:lineRule="auto"/>
+              <w:jc w:val="left"/>
+            </w:pPr>
+            <w:r>
+              <w:rPr>
+                <w:rFonts w:ascii="Times New Roman" w:hAnsi="Times New Roman" w:eastAsia="Times New Roman" w:cs="Times New Roman"/>
+                <w:b w:val="0"/>
+                <w:i w:val="0"/>
+                <w:color w:val="000000"/>
+                <w:sz w:val="18"/>
+              </w:rPr>
+              <w:t xml:space="preserve">Пробные прогоны (E4–E5): агент не мог зафиксировать противоречие, потому что не видел своего прошлого предсказания; добавлен возврат предсказания в наблюдение (E7), и поведение изменилось. Три ошибки инструмента, скрывавшие видимое человеку (E6), исправлены и записаны.</w:t>
             </w:r>
           </w:p>
         </w:tc>
@@ -12279,7 +11941,7 @@
                 <w:color w:val="000000"/>
                 <w:sz w:val="18"/>
               </w:rPr>
-              <w:t xml:space="preserve">Внешний разбор: перестроен учебный план (комнаты 1–2 без опасности, опасность в 3, отражатель в 5). Движок v3: смена правил стала смертельной, а не дорогой. Первый непрерывный прогон. Обнаружено, что критерий восстановления засчитывал угадывание по коридору; критерий заменён на «верное предсказание на изменённом поле + пройденная комната» (v4, 8 комнат).</w:t>
+              <w:t xml:space="preserve">Внешний разбор (E9): три реальные ошибки и перестройка учебного плана — комнаты 1–2 без опасности, опасность в 3, отражатель в 5. Первый непрерывный прогон (E10). Реплей журналов и проверки сделаны частью сборки (E11).</w:t>
             </w:r>
           </w:p>
         </w:tc>
@@ -12325,7 +11987,145 @@
                 <w:color w:val="000000"/>
                 <w:sz w:val="18"/>
               </w:rPr>
-              <w:t xml:space="preserve">Движок v5: добавлены комнаты 9–11 и возврат правил перед комнатой 10; метрики считаются по каждой смене; введён строгий R1. Основной прогон native-агента: 11/11 комнат, обе смены восстановлены. Ожидания по комнатам 9–11 записаны до прогона и проверены после.</w:t>
+              <w:t xml:space="preserve">Движок v3 (E12): смена правил стала смертельной, а не просто дорогой. Одна и та же ошибка инструмента в третий раз (E13) — записана как урок о проверках. Поведение «добавить условие, не трогая корень» повторилось на новой версии (E14).</w:t>
+            </w:r>
+          </w:p>
+        </w:tc>
+      </w:tr>
+      <w:tr>
+        <w:tc>
+          <w:tcPr>
+            <w:tcW w:w="1400" w:type="dxa"/>
+            <w:vAlign w:val="center"/>
+          </w:tcPr>
+          <w:p>
+            <w:pPr>
+              <w:spacing w:before="20" w:after="20" w:line="240" w:lineRule="auto"/>
+              <w:jc w:val="left"/>
+            </w:pPr>
+            <w:r>
+              <w:rPr>
+                <w:rFonts w:ascii="Times New Roman" w:hAnsi="Times New Roman" w:eastAsia="Times New Roman" w:cs="Times New Roman"/>
+                <w:b w:val="0"/>
+                <w:i w:val="0"/>
+                <w:color w:val="000000"/>
+                <w:sz w:val="18"/>
+              </w:rPr>
+              <w:t xml:space="preserve">19.09.2026</w:t>
+            </w:r>
+          </w:p>
+        </w:tc>
+        <w:tc>
+          <w:tcPr>
+            <w:tcW w:w="8000" w:type="dxa"/>
+            <w:vAlign w:val="center"/>
+          </w:tcPr>
+          <w:p>
+            <w:pPr>
+              <w:spacing w:before="20" w:after="20" w:line="240" w:lineRule="auto"/>
+              <w:jc w:val="left"/>
+            </w:pPr>
+            <w:r>
+              <w:rPr>
+                <w:rFonts w:ascii="Times New Roman" w:hAnsi="Times New Roman" w:eastAsia="Times New Roman" w:cs="Times New Roman"/>
+                <w:b w:val="0"/>
+                <w:i w:val="0"/>
+                <w:color w:val="000000"/>
+                <w:sz w:val="18"/>
+              </w:rPr>
+              <w:t xml:space="preserve">Ручное управление протоколом не масштабируется; написан консольный прогон, посылающий ровно тот же промпт, что и браузер (E15). Разбор v4 (E16): проект измерял не то в четырёх местах — критерий восстановления засчитывал угадывание по коридору; введён критерий «верное предсказание на изменённом поле + пройденная комната».</w:t>
+            </w:r>
+          </w:p>
+        </w:tc>
+      </w:tr>
+      <w:tr>
+        <w:tc>
+          <w:tcPr>
+            <w:tcW w:w="1400" w:type="dxa"/>
+            <w:vAlign w:val="center"/>
+          </w:tcPr>
+          <w:p>
+            <w:pPr>
+              <w:spacing w:before="20" w:after="20" w:line="240" w:lineRule="auto"/>
+              <w:jc w:val="left"/>
+            </w:pPr>
+            <w:r>
+              <w:rPr>
+                <w:rFonts w:ascii="Times New Roman" w:hAnsi="Times New Roman" w:eastAsia="Times New Roman" w:cs="Times New Roman"/>
+                <w:b w:val="0"/>
+                <w:i w:val="0"/>
+                <w:color w:val="000000"/>
+                <w:sz w:val="18"/>
+              </w:rPr>
+              <w:t xml:space="preserve">19.09.2026</w:t>
+            </w:r>
+          </w:p>
+        </w:tc>
+        <w:tc>
+          <w:tcPr>
+            <w:tcW w:w="8000" w:type="dxa"/>
+            <w:vAlign w:val="center"/>
+          </w:tcPr>
+          <w:p>
+            <w:pPr>
+              <w:spacing w:before="20" w:after="20" w:line="240" w:lineRule="auto"/>
+              <w:jc w:val="left"/>
+            </w:pPr>
+            <w:r>
+              <w:rPr>
+                <w:rFonts w:ascii="Times New Roman" w:hAnsi="Times New Roman" w:eastAsia="Times New Roman" w:cs="Times New Roman"/>
+                <w:b w:val="0"/>
+                <w:i w:val="0"/>
+                <w:color w:val="000000"/>
+                <w:sz w:val="18"/>
+              </w:rPr>
+              <w:t xml:space="preserve">Пилотный прогон на 8 комнатах (E17): по нестрогому R1 «восстановлен», но нажатие было на две трети по мёртвому правилу; введён строгий R1, заморожен до основного прогона. Ещё два пилотных прогона (E18): бюджет 25 против 100 меняет исследование (20 против 72 нажатий в одной комнате); один субъект вообще не дошёл до свидетельства смены.</w:t>
+            </w:r>
+          </w:p>
+        </w:tc>
+      </w:tr>
+      <w:tr>
+        <w:tc>
+          <w:tcPr>
+            <w:tcW w:w="1400" w:type="dxa"/>
+            <w:vAlign w:val="center"/>
+          </w:tcPr>
+          <w:p>
+            <w:pPr>
+              <w:spacing w:before="20" w:after="20" w:line="240" w:lineRule="auto"/>
+              <w:jc w:val="left"/>
+            </w:pPr>
+            <w:r>
+              <w:rPr>
+                <w:rFonts w:ascii="Times New Roman" w:hAnsi="Times New Roman" w:eastAsia="Times New Roman" w:cs="Times New Roman"/>
+                <w:b w:val="0"/>
+                <w:i w:val="0"/>
+                <w:color w:val="000000"/>
+                <w:sz w:val="18"/>
+              </w:rPr>
+              <w:t xml:space="preserve">19.09.2026</w:t>
+            </w:r>
+          </w:p>
+        </w:tc>
+        <w:tc>
+          <w:tcPr>
+            <w:tcW w:w="8000" w:type="dxa"/>
+            <w:vAlign w:val="center"/>
+          </w:tcPr>
+          <w:p>
+            <w:pPr>
+              <w:spacing w:before="20" w:after="20" w:line="240" w:lineRule="auto"/>
+              <w:jc w:val="left"/>
+            </w:pPr>
+            <w:r>
+              <w:rPr>
+                <w:rFonts w:ascii="Times New Roman" w:hAnsi="Times New Roman" w:eastAsia="Times New Roman" w:cs="Times New Roman"/>
+                <w:b w:val="0"/>
+                <w:i w:val="0"/>
+                <w:color w:val="000000"/>
+                <w:sz w:val="18"/>
+              </w:rPr>
+              <w:t xml:space="preserve">Движок v5 (E19): комнаты 9–11 и возврат правил перед комнатой 10, метрики по каждой смене, ожидания записаны до прогона. Основной прогон агента с собственным контекстом (E20): 11/11, обе смены восстановлены; ожидания по комнатам 9–11 сверены с результатом.</w:t>
             </w:r>
           </w:p>
         </w:tc>
@@ -12371,7 +12171,7 @@
                 <w:color w:val="000000"/>
                 <w:sz w:val="18"/>
               </w:rPr>
-              <w:t xml:space="preserve">Четыре вариации параметров (ранняя смена, три смены, абляция came_from, бюджет 25), ожидания записаны до запуска. Оформление работы.</w:t>
+              <w:t xml:space="preserve">План из трёх условий заменён (E21) на четыре вариации параметров при той же скрытности (E22): ожидания записаны до запуска, два подтвердились, два опровергнуты. Оформление работы; рецензия; исправлены причинные формулировки, добавлена полнота ответов.</w:t>
             </w:r>
           </w:p>
         </w:tc>

</xml_diff>

<commit_message>
Paper: four more figures -- observation boundary, the swap on room 7, real trajectories (main run rooms 7-8, variant B room 8)
Co-Authored-By: Claude Opus 5 <noreply@anthropic.com>
</commit_message>
<xml_diff>
--- a/paper/AURA_v2_documentation.docx
+++ b/paper/AURA_v2_documentation.docx
@@ -3871,6 +3871,65 @@
     </w:p>
     <w:p>
       <w:pPr>
+        <w:keepNext/>
+        <w:spacing w:before="120" w:after="60" w:line="240" w:lineRule="auto"/>
+        <w:jc w:val="center"/>
+      </w:pPr>
+      <w:r>
+        <w:drawing>
+          <wp:inline distT="0" distB="0" distL="0" distR="0">
+            <wp:extent cx="5486400" cy="3162009"/>
+            <wp:docPr id="103" name="Picture 3"/>
+            <wp:cNvGraphicFramePr>
+              <a:graphicFrameLocks xmlns:a="http://schemas.openxmlformats.org/drawingml/2006/main" noChangeAspect="1"/>
+            </wp:cNvGraphicFramePr>
+            <a:graphic xmlns:a="http://schemas.openxmlformats.org/drawingml/2006/main">
+              <a:graphicData uri="http://schemas.openxmlformats.org/drawingml/2006/picture">
+                <pic:pic xmlns:pic="http://schemas.openxmlformats.org/drawingml/2006/picture">
+                  <pic:nvPicPr>
+                    <pic:cNvPr id="0" name="image3.png"/>
+                    <pic:cNvPicPr/>
+                  </pic:nvPicPr>
+                  <pic:blipFill>
+                    <a:blip r:embed="rIdImg3"/>
+                    <a:stretch>
+                      <a:fillRect/>
+                    </a:stretch>
+                  </pic:blipFill>
+                  <pic:spPr>
+                    <a:xfrm>
+                      <a:off x="0" y="0"/>
+                      <a:ext cx="5486400" cy="3162009"/>
+                    </a:xfrm>
+                    <a:prstGeom prst="rect">
+                      <a:avLst/>
+                    </a:prstGeom>
+                  </pic:spPr>
+                </pic:pic>
+              </a:graphicData>
+            </a:graphic>
+          </wp:inline>
+        </w:drawing>
+      </w:r>
+    </w:p>
+    <w:p>
+      <w:pPr>
+        <w:spacing w:before="0" w:after="160" w:line="360" w:lineRule="auto"/>
+        <w:jc w:val="center"/>
+      </w:pPr>
+      <w:r>
+        <w:rPr>
+          <w:rFonts w:ascii="Times New Roman" w:hAnsi="Times New Roman" w:eastAsia="Times New Roman" w:cs="Times New Roman"/>
+          <w:b w:val="0"/>
+          <w:i/>
+          <w:color w:val="000000"/>
+          <w:sz w:val="20"/>
+        </w:rPr>
+        <w:t xml:space="preserve">Рис. 4. Граница наблюдения на примере комнаты 3: слева — карта с истинными значениями поверхностей, справа — то, что получает агент: имена плиток говорят, как они выглядят, а не что делают.</w:t>
+      </w:r>
+    </w:p>
+    <w:p>
+      <w:pPr>
         <w:spacing w:before="0" w:after="120" w:line="360" w:lineRule="auto"/>
         <w:jc w:val="both"/>
       </w:pPr>
@@ -3947,7 +4006,7 @@
           <w:color w:val="000000"/>
           <w:sz w:val="24"/>
         </w:rPr>
-        <w:t xml:space="preserve">Ответ (рис. 4) содержит кнопку, гипотезу (что этим нажатием проверяется), предсказание словами, четыре проверяемых поля и флаг противоречия: что из увиденного расходится с тем, во что агент верил. Четыре поля — конечная клетка, изменилась ли позиция, оказалась ли сущность на стартовой клетке комнаты, сменится ли комната. Любое поле можно оставить пустым, и это засчитывается как отказ от ответа, а не как ошибка; инструкция прямо говорит, что гадать хуже, чем промолчать.</w:t>
+        <w:t xml:space="preserve">Ответ (рис. 5) содержит кнопку, гипотезу (что этим нажатием проверяется), предсказание словами, четыре проверяемых поля и флаг противоречия: что из увиденного расходится с тем, во что агент верил. Четыре поля — конечная клетка, изменилась ли позиция, оказалась ли сущность на стартовой клетке комнаты, сменится ли комната. Любое поле можно оставить пустым, и это засчитывается как отказ от ответа, а не как ошибка; инструкция прямо говорит, что гадать хуже, чем промолчать.</w:t>
       </w:r>
     </w:p>
     <w:p>
@@ -4068,7 +4127,7 @@
           <w:color w:val="000000"/>
           <w:sz w:val="20"/>
         </w:rPr>
-        <w:t xml:space="preserve">Рис. 4. Ответ агента на шаге 11 основного прогона: первое нажатие после возврата на старт в комнате 3.</w:t>
+        <w:t xml:space="preserve">Рис. 5. Ответ агента на шаге 11 основного прогона: первое нажатие после возврата на старт в комнате 3.</w:t>
       </w:r>
     </w:p>
     <w:p>
@@ -4183,6 +4242,65 @@
           <w:sz w:val="24"/>
         </w:rPr>
         <w:t xml:space="preserve">Для вариаций момент смены задаётся параметром запуска и записывается в заголовок журнала; прогон отказывается стартовать, если при заданном расписании хоть одна комната от первой смены и дальше неразрешима в каком-либо из режимов или если комната без опасной поверхности пришлась бы на сменённые правила.</w:t>
+      </w:r>
+    </w:p>
+    <w:p>
+      <w:pPr>
+        <w:keepNext/>
+        <w:spacing w:before="120" w:after="60" w:line="240" w:lineRule="auto"/>
+        <w:jc w:val="center"/>
+      </w:pPr>
+      <w:r>
+        <w:drawing>
+          <wp:inline distT="0" distB="0" distL="0" distR="0">
+            <wp:extent cx="5486400" cy="1840831"/>
+            <wp:docPr id="104" name="Picture 4"/>
+            <wp:cNvGraphicFramePr>
+              <a:graphicFrameLocks xmlns:a="http://schemas.openxmlformats.org/drawingml/2006/main" noChangeAspect="1"/>
+            </wp:cNvGraphicFramePr>
+            <a:graphic xmlns:a="http://schemas.openxmlformats.org/drawingml/2006/main">
+              <a:graphicData uri="http://schemas.openxmlformats.org/drawingml/2006/picture">
+                <pic:pic xmlns:pic="http://schemas.openxmlformats.org/drawingml/2006/picture">
+                  <pic:nvPicPr>
+                    <pic:cNvPr id="0" name="image4.png"/>
+                    <pic:cNvPicPr/>
+                  </pic:nvPicPr>
+                  <pic:blipFill>
+                    <a:blip r:embed="rIdImg4"/>
+                    <a:stretch>
+                      <a:fillRect/>
+                    </a:stretch>
+                  </pic:blipFill>
+                  <pic:spPr>
+                    <a:xfrm>
+                      <a:off x="0" y="0"/>
+                      <a:ext cx="5486400" cy="1840831"/>
+                    </a:xfrm>
+                    <a:prstGeom prst="rect">
+                      <a:avLst/>
+                    </a:prstGeom>
+                  </pic:spPr>
+                </pic:pic>
+              </a:graphicData>
+            </a:graphic>
+          </wp:inline>
+        </w:drawing>
+      </w:r>
+    </w:p>
+    <w:p>
+      <w:pPr>
+        <w:spacing w:before="0" w:after="160" w:line="360" w:lineRule="auto"/>
+        <w:jc w:val="center"/>
+      </w:pPr>
+      <w:r>
+        <w:rPr>
+          <w:rFonts w:ascii="Times New Roman" w:hAnsi="Times New Roman" w:eastAsia="Times New Roman" w:cs="Times New Roman"/>
+          <w:b w:val="0"/>
+          <w:i/>
+          <w:color w:val="000000"/>
+          <w:sz w:val="20"/>
+        </w:rPr>
+        <w:t xml:space="preserve">Рис. 6. Комната 7 до и после смены: маршрут, который агент шесть комнат учился предпочитать (длинный, к кольцам), после смены возвращает на старт, а короткий к спицам завершает комнату. Карта не меняется.</w:t>
       </w:r>
     </w:p>
     <w:p>
@@ -6766,7 +6884,7 @@
         <w:drawing>
           <wp:inline distT="0" distB="0" distL="0" distR="0">
             <wp:extent cx="5486400" cy="2598558"/>
-            <wp:docPr id="103" name="Picture 3"/>
+            <wp:docPr id="105" name="Picture 5"/>
             <wp:cNvGraphicFramePr>
               <a:graphicFrameLocks xmlns:a="http://schemas.openxmlformats.org/drawingml/2006/main" noChangeAspect="1"/>
             </wp:cNvGraphicFramePr>
@@ -6774,11 +6892,11 @@
               <a:graphicData uri="http://schemas.openxmlformats.org/drawingml/2006/picture">
                 <pic:pic xmlns:pic="http://schemas.openxmlformats.org/drawingml/2006/picture">
                   <pic:nvPicPr>
-                    <pic:cNvPr id="0" name="image3.png"/>
+                    <pic:cNvPr id="0" name="image5.png"/>
                     <pic:cNvPicPr/>
                   </pic:nvPicPr>
                   <pic:blipFill>
-                    <a:blip r:embed="rIdImg3"/>
+                    <a:blip r:embed="rIdImg5"/>
                     <a:stretch>
                       <a:fillRect/>
                     </a:stretch>
@@ -6812,7 +6930,7 @@
           <w:color w:val="000000"/>
           <w:sz w:val="20"/>
         </w:rPr>
-        <w:t xml:space="preserve">Рис. 5. Нажатий на комнату против кратчайшего пути в основном прогоне; крестики — возвраты на старт.</w:t>
+        <w:t xml:space="preserve">Рис. 7. Нажатий на комнату против кратчайшего пути в основном прогоне; крестики — возвраты на старт.</w:t>
       </w:r>
     </w:p>
     <w:p>
@@ -7503,7 +7621,7 @@
         <w:drawing>
           <wp:inline distT="0" distB="0" distL="0" distR="0">
             <wp:extent cx="5486400" cy="2123767"/>
-            <wp:docPr id="104" name="Picture 4"/>
+            <wp:docPr id="106" name="Picture 6"/>
             <wp:cNvGraphicFramePr>
               <a:graphicFrameLocks xmlns:a="http://schemas.openxmlformats.org/drawingml/2006/main" noChangeAspect="1"/>
             </wp:cNvGraphicFramePr>
@@ -7511,11 +7629,11 @@
               <a:graphicData uri="http://schemas.openxmlformats.org/drawingml/2006/picture">
                 <pic:pic xmlns:pic="http://schemas.openxmlformats.org/drawingml/2006/picture">
                   <pic:nvPicPr>
-                    <pic:cNvPr id="0" name="image4.png"/>
+                    <pic:cNvPr id="0" name="image6.png"/>
                     <pic:cNvPicPr/>
                   </pic:nvPicPr>
                   <pic:blipFill>
-                    <a:blip r:embed="rIdImg4"/>
+                    <a:blip r:embed="rIdImg6"/>
                     <a:stretch>
                       <a:fillRect/>
                     </a:stretch>
@@ -7549,7 +7667,66 @@
           <w:color w:val="000000"/>
           <w:sz w:val="20"/>
         </w:rPr>
-        <w:t xml:space="preserve">Рис. 6. Основной прогон по нажатиям: комнаты, обе смены правил, возвраты на старт и моменты свидетельства, R2 и строгого R1.</w:t>
+        <w:t xml:space="preserve">Рис. 8. Основной прогон по нажатиям: комнаты, обе смены правил, возвраты на старт и моменты свидетельства, R2 и строгого R1.</w:t>
+      </w:r>
+    </w:p>
+    <w:p>
+      <w:pPr>
+        <w:keepNext/>
+        <w:spacing w:before="120" w:after="60" w:line="240" w:lineRule="auto"/>
+        <w:jc w:val="center"/>
+      </w:pPr>
+      <w:r>
+        <w:drawing>
+          <wp:inline distT="0" distB="0" distL="0" distR="0">
+            <wp:extent cx="5486400" cy="2239433"/>
+            <wp:docPr id="107" name="Picture 7"/>
+            <wp:cNvGraphicFramePr>
+              <a:graphicFrameLocks xmlns:a="http://schemas.openxmlformats.org/drawingml/2006/main" noChangeAspect="1"/>
+            </wp:cNvGraphicFramePr>
+            <a:graphic xmlns:a="http://schemas.openxmlformats.org/drawingml/2006/main">
+              <a:graphicData uri="http://schemas.openxmlformats.org/drawingml/2006/picture">
+                <pic:pic xmlns:pic="http://schemas.openxmlformats.org/drawingml/2006/picture">
+                  <pic:nvPicPr>
+                    <pic:cNvPr id="0" name="image7.png"/>
+                    <pic:cNvPicPr/>
+                  </pic:nvPicPr>
+                  <pic:blipFill>
+                    <a:blip r:embed="rIdImg7"/>
+                    <a:stretch>
+                      <a:fillRect/>
+                    </a:stretch>
+                  </pic:blipFill>
+                  <pic:spPr>
+                    <a:xfrm>
+                      <a:off x="0" y="0"/>
+                      <a:ext cx="5486400" cy="2239433"/>
+                    </a:xfrm>
+                    <a:prstGeom prst="rect">
+                      <a:avLst/>
+                    </a:prstGeom>
+                  </pic:spPr>
+                </pic:pic>
+              </a:graphicData>
+            </a:graphic>
+          </wp:inline>
+        </w:drawing>
+      </w:r>
+    </w:p>
+    <w:p>
+      <w:pPr>
+        <w:spacing w:before="0" w:after="160" w:line="360" w:lineRule="auto"/>
+        <w:jc w:val="center"/>
+      </w:pPr>
+      <w:r>
+        <w:rPr>
+          <w:rFonts w:ascii="Times New Roman" w:hAnsi="Times New Roman" w:eastAsia="Times New Roman" w:cs="Times New Roman"/>
+          <w:b w:val="0"/>
+          <w:i/>
+          <w:color w:val="000000"/>
+          <w:sz w:val="20"/>
+        </w:rPr>
+        <w:t xml:space="preserve">Рис. 9. Реальные траектории агента в комнатах 7 и 8 основного прогона по журналу: в обеих он сначала идёт к кольцам, и только после второго возврата пересмотр становится правилом.</w:t>
       </w:r>
     </w:p>
     <w:p>
@@ -8692,7 +8869,7 @@
           <w:color w:val="000000"/>
           <w:sz w:val="20"/>
         </w:rPr>
-        <w:t xml:space="preserve">Табл. 4. Пять прогонов. Полнота — доля заполненных проверяемых полей; на изменённых полях считается только по различающим нажатиям после смены. Нажатия по комнатам — рис. 7.</w:t>
+        <w:t xml:space="preserve">Табл. 4. Пять прогонов. Полнота — доля заполненных проверяемых полей; на изменённых полях считается только по различающим нажатиям после смены. Нажатия по комнатам — рис. 10.</w:t>
       </w:r>
     </w:p>
     <w:tbl>
@@ -10637,7 +10814,7 @@
         <w:drawing>
           <wp:inline distT="0" distB="0" distL="0" distR="0">
             <wp:extent cx="5486400" cy="2753175"/>
-            <wp:docPr id="105" name="Picture 5"/>
+            <wp:docPr id="108" name="Picture 8"/>
             <wp:cNvGraphicFramePr>
               <a:graphicFrameLocks xmlns:a="http://schemas.openxmlformats.org/drawingml/2006/main" noChangeAspect="1"/>
             </wp:cNvGraphicFramePr>
@@ -10645,11 +10822,11 @@
               <a:graphicData uri="http://schemas.openxmlformats.org/drawingml/2006/picture">
                 <pic:pic xmlns:pic="http://schemas.openxmlformats.org/drawingml/2006/picture">
                   <pic:nvPicPr>
-                    <pic:cNvPr id="0" name="image5.png"/>
+                    <pic:cNvPr id="0" name="image8.png"/>
                     <pic:cNvPicPr/>
                   </pic:nvPicPr>
                   <pic:blipFill>
-                    <a:blip r:embed="rIdImg5"/>
+                    <a:blip r:embed="rIdImg8"/>
                     <a:stretch>
                       <a:fillRect/>
                     </a:stretch>
@@ -10683,7 +10860,7 @@
           <w:color w:val="000000"/>
           <w:sz w:val="20"/>
         </w:rPr>
-        <w:t xml:space="preserve">Рис. 7. Нажатий на комнату в пяти прогонах; крестик — в комнате был возврат на старт. Пик вариации B в комнате 8 — четыре гибели на одной клетке.</w:t>
+        <w:t xml:space="preserve">Рис. 10. Нажатий на комнату в пяти прогонах; крестик — в комнате был возврат на старт. Пик вариации B в комнате 8 — четыре гибели на одной клетке.</w:t>
       </w:r>
     </w:p>
     <w:p>
@@ -10696,7 +10873,7 @@
         <w:drawing>
           <wp:inline distT="0" distB="0" distL="0" distR="0">
             <wp:extent cx="5486400" cy="2029320"/>
-            <wp:docPr id="106" name="Picture 6"/>
+            <wp:docPr id="109" name="Picture 9"/>
             <wp:cNvGraphicFramePr>
               <a:graphicFrameLocks xmlns:a="http://schemas.openxmlformats.org/drawingml/2006/main" noChangeAspect="1"/>
             </wp:cNvGraphicFramePr>
@@ -10704,11 +10881,11 @@
               <a:graphicData uri="http://schemas.openxmlformats.org/drawingml/2006/picture">
                 <pic:pic xmlns:pic="http://schemas.openxmlformats.org/drawingml/2006/picture">
                   <pic:nvPicPr>
-                    <pic:cNvPr id="0" name="image6.png"/>
+                    <pic:cNvPr id="0" name="image9.png"/>
                     <pic:cNvPicPr/>
                   </pic:nvPicPr>
                   <pic:blipFill>
-                    <a:blip r:embed="rIdImg6"/>
+                    <a:blip r:embed="rIdImg9"/>
                     <a:stretch>
                       <a:fillRect/>
                     </a:stretch>
@@ -10742,7 +10919,7 @@
           <w:color w:val="000000"/>
           <w:sz w:val="20"/>
         </w:rPr>
-        <w:t xml:space="preserve">Рис. 8. Цена каждой смены: гибели по старому правилу и задержка от первого свидетельства до строгого R1.</w:t>
+        <w:t xml:space="preserve">Рис. 11. Цена каждой смены: гибели по старому правилу и задержка от первого свидетельства до строгого R1.</w:t>
       </w:r>
     </w:p>
     <w:p>
@@ -10952,6 +11129,65 @@
           <w:sz w:val="24"/>
         </w:rPr>
         <w:t xml:space="preserve">Неуспешный случай: комната 8 в вариации B. Сорок шесть нажатий и четыре гибели на одной клетке. Гипотезы агента в этой комнате по порядку: «активирует ли спицы соседний выход», «нужно ли сначала активировать переключатели tile_1», «следующая позиция переключателя в нижнем ряду» (шесть раз подряд), «достаточно ли активированы спицы теперь». Кольца в одной клетке от места гибели не тронуты ни разу до 69-го нажатия. Модель «замок с переключателями» непротиворечива со всем, что агент видел за три смены, и не опровергается ни одной отдельной гибелью; опровергнуть её мог бы только счёт, а счёт агент не ведёт.</w:t>
+      </w:r>
+    </w:p>
+    <w:p>
+      <w:pPr>
+        <w:keepNext/>
+        <w:spacing w:before="120" w:after="60" w:line="240" w:lineRule="auto"/>
+        <w:jc w:val="center"/>
+      </w:pPr>
+      <w:r>
+        <w:drawing>
+          <wp:inline distT="0" distB="0" distL="0" distR="0">
+            <wp:extent cx="5486400" cy="2330469"/>
+            <wp:docPr id="110" name="Picture 10"/>
+            <wp:cNvGraphicFramePr>
+              <a:graphicFrameLocks xmlns:a="http://schemas.openxmlformats.org/drawingml/2006/main" noChangeAspect="1"/>
+            </wp:cNvGraphicFramePr>
+            <a:graphic xmlns:a="http://schemas.openxmlformats.org/drawingml/2006/main">
+              <a:graphicData uri="http://schemas.openxmlformats.org/drawingml/2006/picture">
+                <pic:pic xmlns:pic="http://schemas.openxmlformats.org/drawingml/2006/picture">
+                  <pic:nvPicPr>
+                    <pic:cNvPr id="0" name="image10.png"/>
+                    <pic:cNvPicPr/>
+                  </pic:nvPicPr>
+                  <pic:blipFill>
+                    <a:blip r:embed="rIdImg10"/>
+                    <a:stretch>
+                      <a:fillRect/>
+                    </a:stretch>
+                  </pic:blipFill>
+                  <pic:spPr>
+                    <a:xfrm>
+                      <a:off x="0" y="0"/>
+                      <a:ext cx="5486400" cy="2330469"/>
+                    </a:xfrm>
+                    <a:prstGeom prst="rect">
+                      <a:avLst/>
+                    </a:prstGeom>
+                  </pic:spPr>
+                </pic:pic>
+              </a:graphicData>
+            </a:graphic>
+          </wp:inline>
+        </w:drawing>
+      </w:r>
+    </w:p>
+    <w:p>
+      <w:pPr>
+        <w:spacing w:before="0" w:after="160" w:line="360" w:lineRule="auto"/>
+        <w:jc w:val="center"/>
+      </w:pPr>
+      <w:r>
+        <w:rPr>
+          <w:rFonts w:ascii="Times New Roman" w:hAnsi="Times New Roman" w:eastAsia="Times New Roman" w:cs="Times New Roman"/>
+          <w:b w:val="0"/>
+          <w:i/>
+          <w:color w:val="000000"/>
+          <w:sz w:val="20"/>
+        </w:rPr>
+        <w:t xml:space="preserve">Рис. 12. Комната 8 в вариации B по журналу: траектория с четырьмя возвратами со спиц (слева) и число посещений каждой клетки (справа); кольца-выход в одной клетке от места гибели не тронуты до 69-го нажатия.</w:t>
       </w:r>
     </w:p>
     <w:p>

</xml_diff>